<commit_message>
Add placeholders to remark fields in Mitrac Y3 form and update report links
- Updated the Mitrac Y3 form to include Thai placeholders for remark input fields, enhancing user guidance.
- Added links for M3, M6, and Y1 forms in the report overview for improved navigation.
</commit_message>
<xml_diff>
--- a/app/report/templates/docx_templates/MITRAC (Y3).docx
+++ b/app/report/templates/docx_templates/MITRAC (Y3).docx
@@ -65,8 +65,20 @@
                 <w:sz w:val="24"/>
                 <w:szCs w:val="32"/>
               </w:rPr>
-              <w:t>LEADER WAYSIDE :</w:t>
-            </w:r>
+              <w:t xml:space="preserve">LEADER </w:t>
+            </w:r>
+            <w:proofErr w:type="gramStart"/>
+            <w:r>
+              <w:rPr>
+                <w:rFonts w:asciiTheme="majorBidi" w:hAnsiTheme="majorBidi" w:cstheme="majorBidi"/>
+                <w:b/>
+                <w:bCs/>
+                <w:sz w:val="24"/>
+                <w:szCs w:val="32"/>
+              </w:rPr>
+              <w:t>WAYSIDE :</w:t>
+            </w:r>
+            <w:proofErr w:type="gramEnd"/>
           </w:p>
         </w:tc>
         <w:tc>
@@ -110,6 +122,7 @@
                 <w:szCs w:val="24"/>
               </w:rPr>
             </w:pPr>
+            <w:proofErr w:type="gramStart"/>
             <w:r>
               <w:rPr>
                 <w:rFonts w:asciiTheme="majorBidi" w:hAnsiTheme="majorBidi" w:cstheme="majorBidi"/>
@@ -121,6 +134,7 @@
               </w:rPr>
               <w:t>DATE :</w:t>
             </w:r>
+            <w:proofErr w:type="gramEnd"/>
           </w:p>
         </w:tc>
         <w:tc>
@@ -164,6 +178,7 @@
                 <w:szCs w:val="24"/>
               </w:rPr>
             </w:pPr>
+            <w:proofErr w:type="gramStart"/>
             <w:r>
               <w:rPr>
                 <w:rFonts w:asciiTheme="majorBidi" w:hAnsiTheme="majorBidi" w:cstheme="majorBidi"/>
@@ -175,6 +190,7 @@
               </w:rPr>
               <w:t>TIME :</w:t>
             </w:r>
+            <w:proofErr w:type="gramEnd"/>
           </w:p>
         </w:tc>
         <w:tc>
@@ -333,6 +349,7 @@
                 <w:szCs w:val="24"/>
               </w:rPr>
             </w:pPr>
+            <w:proofErr w:type="gramStart"/>
             <w:r>
               <w:rPr>
                 <w:rFonts w:asciiTheme="majorBidi" w:hAnsiTheme="majorBidi" w:cstheme="majorBidi"/>
@@ -344,6 +361,7 @@
               </w:rPr>
               <w:t>STATION :</w:t>
             </w:r>
+            <w:proofErr w:type="gramEnd"/>
           </w:p>
         </w:tc>
         <w:tc>
@@ -397,8 +415,21 @@
                 <w:sz w:val="24"/>
                 <w:szCs w:val="24"/>
               </w:rPr>
-              <w:t>LOCATION AREA :</w:t>
-            </w:r>
+              <w:t xml:space="preserve">LOCATION </w:t>
+            </w:r>
+            <w:proofErr w:type="gramStart"/>
+            <w:r>
+              <w:rPr>
+                <w:rFonts w:asciiTheme="majorBidi" w:hAnsiTheme="majorBidi" w:cstheme="majorBidi"/>
+                <w:b/>
+                <w:bCs/>
+                <w:color w:val="000000" w:themeColor="text1"/>
+                <w:sz w:val="24"/>
+                <w:szCs w:val="24"/>
+              </w:rPr>
+              <w:t>AREA :</w:t>
+            </w:r>
+            <w:proofErr w:type="gramEnd"/>
           </w:p>
         </w:tc>
         <w:tc>
@@ -445,6 +476,7 @@
                 <w:szCs w:val="32"/>
               </w:rPr>
             </w:pPr>
+            <w:proofErr w:type="gramStart"/>
             <w:r>
               <w:rPr>
                 <w:rFonts w:asciiTheme="majorBidi" w:hAnsiTheme="majorBidi" w:cstheme="majorBidi"/>
@@ -455,6 +487,7 @@
               </w:rPr>
               <w:t>APOSTLE :</w:t>
             </w:r>
+            <w:proofErr w:type="gramEnd"/>
           </w:p>
         </w:tc>
         <w:tc>
@@ -539,8 +572,9 @@
                 <w:sz w:val="24"/>
                 <w:szCs w:val="32"/>
               </w:rPr>
-              <w:t xml:space="preserve"> NO </w:t>
-            </w:r>
+              <w:t xml:space="preserve"> </w:t>
+            </w:r>
+            <w:proofErr w:type="gramStart"/>
             <w:r>
               <w:rPr>
                 <w:rFonts w:asciiTheme="majorBidi" w:hAnsiTheme="majorBidi" w:cstheme="majorBidi"/>
@@ -550,8 +584,20 @@
                 <w:sz w:val="24"/>
                 <w:szCs w:val="32"/>
               </w:rPr>
+              <w:t xml:space="preserve">NO </w:t>
+            </w:r>
+            <w:r>
+              <w:rPr>
+                <w:rFonts w:asciiTheme="majorBidi" w:hAnsiTheme="majorBidi" w:cstheme="majorBidi"/>
+                <w:b/>
+                <w:bCs/>
+                <w:color w:val="000000" w:themeColor="text1"/>
+                <w:sz w:val="24"/>
+                <w:szCs w:val="32"/>
+              </w:rPr>
               <w:t>:</w:t>
             </w:r>
+            <w:proofErr w:type="gramEnd"/>
           </w:p>
         </w:tc>
         <w:tc>
@@ -685,8 +731,20 @@
                 <w:sz w:val="24"/>
                 <w:szCs w:val="32"/>
               </w:rPr>
-              <w:t>TEAM NAME LIST :</w:t>
-            </w:r>
+              <w:t xml:space="preserve">TEAM NAME </w:t>
+            </w:r>
+            <w:proofErr w:type="gramStart"/>
+            <w:r>
+              <w:rPr>
+                <w:rFonts w:asciiTheme="majorBidi" w:hAnsiTheme="majorBidi" w:cstheme="majorBidi"/>
+                <w:b/>
+                <w:bCs/>
+                <w:sz w:val="24"/>
+                <w:szCs w:val="32"/>
+              </w:rPr>
+              <w:t>LIST :</w:t>
+            </w:r>
+            <w:proofErr w:type="gramEnd"/>
           </w:p>
         </w:tc>
         <w:tc>
@@ -902,8 +960,21 @@
                 <w:sz w:val="24"/>
                 <w:szCs w:val="24"/>
               </w:rPr>
-              <w:t>WORK ORDER NO :</w:t>
-            </w:r>
+              <w:t xml:space="preserve">WORK ORDER </w:t>
+            </w:r>
+            <w:proofErr w:type="gramStart"/>
+            <w:r>
+              <w:rPr>
+                <w:rFonts w:asciiTheme="majorBidi" w:hAnsiTheme="majorBidi" w:cstheme="majorBidi"/>
+                <w:b/>
+                <w:bCs/>
+                <w:color w:val="000000" w:themeColor="text1"/>
+                <w:sz w:val="24"/>
+                <w:szCs w:val="24"/>
+              </w:rPr>
+              <w:t>NO :</w:t>
+            </w:r>
+            <w:proofErr w:type="gramEnd"/>
           </w:p>
         </w:tc>
         <w:tc>
@@ -1131,6 +1202,7 @@
               </w:rPr>
               <w:t xml:space="preserve">WORK </w:t>
             </w:r>
+            <w:proofErr w:type="gramStart"/>
             <w:r>
               <w:rPr>
                 <w:rFonts w:asciiTheme="majorBidi" w:hAnsiTheme="majorBidi" w:cstheme="majorBidi"/>
@@ -1142,6 +1214,7 @@
               </w:rPr>
               <w:t>DESCRIPTION :</w:t>
             </w:r>
+            <w:proofErr w:type="gramEnd"/>
           </w:p>
         </w:tc>
         <w:tc>
@@ -1308,6 +1381,7 @@
                 <w:szCs w:val="24"/>
               </w:rPr>
             </w:pPr>
+            <w:proofErr w:type="gramStart"/>
             <w:r>
               <w:rPr>
                 <w:rFonts w:asciiTheme="majorBidi" w:hAnsiTheme="majorBidi" w:cstheme="majorBidi"/>
@@ -1323,7 +1397,17 @@
                 <w:szCs w:val="24"/>
                 <w:cs/>
               </w:rPr>
-              <w:t xml:space="preserve">เข้า </w:t>
+              <w:t>เข้า</w:t>
+            </w:r>
+            <w:proofErr w:type="gramEnd"/>
+            <w:r>
+              <w:rPr>
+                <w:rFonts w:asciiTheme="majorBidi" w:hAnsiTheme="majorBidi" w:cstheme="majorBidi" w:hint="cs"/>
+                <w:sz w:val="24"/>
+                <w:szCs w:val="24"/>
+                <w:cs/>
+              </w:rPr>
+              <w:t xml:space="preserve"> </w:t>
             </w:r>
           </w:p>
         </w:tc>
@@ -1371,6 +1455,7 @@
                 <w:szCs w:val="24"/>
               </w:rPr>
             </w:pPr>
+            <w:proofErr w:type="gramStart"/>
             <w:r>
               <w:rPr>
                 <w:rFonts w:asciiTheme="majorBidi" w:hAnsiTheme="majorBidi" w:cstheme="majorBidi"/>
@@ -1388,6 +1473,7 @@
               </w:rPr>
               <w:t>ออก</w:t>
             </w:r>
+            <w:proofErr w:type="gramEnd"/>
           </w:p>
         </w:tc>
         <w:tc>
@@ -1477,6 +1563,7 @@
                 <w:szCs w:val="24"/>
               </w:rPr>
             </w:pPr>
+            <w:proofErr w:type="gramStart"/>
             <w:r>
               <w:rPr>
                 <w:rFonts w:asciiTheme="majorBidi" w:hAnsiTheme="majorBidi" w:cstheme="majorBidi"/>
@@ -1491,7 +1578,16 @@
                 <w:sz w:val="24"/>
                 <w:szCs w:val="24"/>
               </w:rPr>
-              <w:t>Earthing Device</w:t>
+              <w:t>Earthing</w:t>
+            </w:r>
+            <w:proofErr w:type="gramEnd"/>
+            <w:r>
+              <w:rPr>
+                <w:rFonts w:asciiTheme="majorBidi" w:hAnsiTheme="majorBidi" w:cstheme="majorBidi"/>
+                <w:sz w:val="24"/>
+                <w:szCs w:val="24"/>
+              </w:rPr>
+              <w:t xml:space="preserve"> Device</w:t>
             </w:r>
             <w:r>
               <w:rPr>
@@ -1547,6 +1643,7 @@
                 <w:szCs w:val="24"/>
               </w:rPr>
             </w:pPr>
+            <w:proofErr w:type="gramStart"/>
             <w:r>
               <w:rPr>
                 <w:rFonts w:asciiTheme="majorBidi" w:hAnsiTheme="majorBidi" w:cstheme="majorBidi"/>
@@ -1561,7 +1658,16 @@
                 <w:sz w:val="24"/>
                 <w:szCs w:val="24"/>
               </w:rPr>
-              <w:t>Voltage Tester</w:t>
+              <w:t>Voltage</w:t>
+            </w:r>
+            <w:proofErr w:type="gramEnd"/>
+            <w:r>
+              <w:rPr>
+                <w:rFonts w:asciiTheme="majorBidi" w:hAnsiTheme="majorBidi" w:cstheme="majorBidi"/>
+                <w:sz w:val="24"/>
+                <w:szCs w:val="24"/>
+              </w:rPr>
+              <w:t xml:space="preserve"> Tester</w:t>
             </w:r>
             <w:r>
               <w:rPr>
@@ -1617,6 +1723,7 @@
                 <w:szCs w:val="24"/>
               </w:rPr>
             </w:pPr>
+            <w:proofErr w:type="gramStart"/>
             <w:r>
               <w:rPr>
                 <w:rFonts w:asciiTheme="majorBidi" w:hAnsiTheme="majorBidi" w:cstheme="majorBidi"/>
@@ -1634,6 +1741,7 @@
               </w:rPr>
               <w:t>ยืม</w:t>
             </w:r>
+            <w:proofErr w:type="gramEnd"/>
           </w:p>
         </w:tc>
         <w:tc>
@@ -1680,6 +1788,7 @@
                 <w:szCs w:val="24"/>
               </w:rPr>
             </w:pPr>
+            <w:proofErr w:type="gramStart"/>
             <w:r>
               <w:rPr>
                 <w:rFonts w:asciiTheme="majorBidi" w:hAnsiTheme="majorBidi" w:cstheme="majorBidi"/>
@@ -1697,6 +1806,7 @@
               </w:rPr>
               <w:t>คืน</w:t>
             </w:r>
+            <w:proofErr w:type="gramEnd"/>
           </w:p>
         </w:tc>
       </w:tr>
@@ -1804,6 +1914,7 @@
                 <w:cs/>
               </w:rPr>
             </w:pPr>
+            <w:proofErr w:type="gramStart"/>
             <w:r>
               <w:rPr>
                 <w:rFonts w:asciiTheme="majorBidi" w:hAnsiTheme="majorBidi" w:cstheme="majorBidi"/>
@@ -1821,6 +1932,7 @@
               </w:rPr>
               <w:t>เข้า</w:t>
             </w:r>
+            <w:proofErr w:type="gramEnd"/>
           </w:p>
         </w:tc>
         <w:tc>
@@ -1865,6 +1977,7 @@
                 <w:cs/>
               </w:rPr>
             </w:pPr>
+            <w:proofErr w:type="gramStart"/>
             <w:r>
               <w:rPr>
                 <w:rFonts w:asciiTheme="majorBidi" w:hAnsiTheme="majorBidi" w:cstheme="majorBidi"/>
@@ -1882,6 +1995,7 @@
               </w:rPr>
               <w:t>ออก</w:t>
             </w:r>
+            <w:proofErr w:type="gramEnd"/>
           </w:p>
         </w:tc>
         <w:tc>
@@ -2234,6 +2348,7 @@
           </w:tcPr>
           <w:p>
             <w:pPr>
+              <w:jc w:val="center"/>
               <w:rPr>
                 <w:rFonts w:asciiTheme="majorBidi" w:hAnsiTheme="majorBidi" w:cstheme="majorBidi"/>
                 <w:sz w:val="24"/>
@@ -2420,6 +2535,7 @@
           </w:tcPr>
           <w:p>
             <w:pPr>
+              <w:jc w:val="center"/>
               <w:rPr>
                 <w:rFonts w:asciiTheme="majorBidi" w:hAnsiTheme="majorBidi" w:cstheme="majorBidi"/>
                 <w:sz w:val="24"/>
@@ -2570,6 +2686,7 @@
           </w:tcPr>
           <w:p>
             <w:pPr>
+              <w:jc w:val="center"/>
               <w:rPr>
                 <w:rFonts w:asciiTheme="majorBidi" w:hAnsiTheme="majorBidi" w:cstheme="majorBidi"/>
                 <w:szCs w:val="22"/>
@@ -2723,6 +2840,7 @@
           </w:tcPr>
           <w:p>
             <w:pPr>
+              <w:jc w:val="center"/>
               <w:rPr>
                 <w:rFonts w:asciiTheme="majorBidi" w:hAnsiTheme="majorBidi" w:cstheme="majorBidi"/>
                 <w:szCs w:val="22"/>
@@ -2900,6 +3018,7 @@
           </w:tcPr>
           <w:p>
             <w:pPr>
+              <w:jc w:val="center"/>
               <w:rPr>
                 <w:rFonts w:asciiTheme="majorBidi" w:hAnsiTheme="majorBidi" w:cstheme="majorBidi"/>
                 <w:szCs w:val="22"/>
@@ -3334,6 +3453,7 @@
           </w:tcPr>
           <w:p>
             <w:pPr>
+              <w:jc w:val="center"/>
               <w:rPr>
                 <w:rFonts w:asciiTheme="majorBidi" w:hAnsiTheme="majorBidi" w:cstheme="majorBidi"/>
                 <w:szCs w:val="22"/>
@@ -3785,6 +3905,7 @@
           </w:tcPr>
           <w:p>
             <w:pPr>
+              <w:jc w:val="center"/>
               <w:rPr>
                 <w:rFonts w:asciiTheme="majorBidi" w:hAnsiTheme="majorBidi" w:cstheme="majorBidi"/>
                 <w:szCs w:val="22"/>
@@ -3980,6 +4101,7 @@
           </w:tcPr>
           <w:p>
             <w:pPr>
+              <w:jc w:val="center"/>
               <w:rPr>
                 <w:rFonts w:asciiTheme="majorBidi" w:hAnsiTheme="majorBidi" w:cstheme="majorBidi"/>
                 <w:szCs w:val="22"/>
@@ -4150,6 +4272,7 @@
           </w:tcPr>
           <w:p>
             <w:pPr>
+              <w:jc w:val="center"/>
               <w:rPr>
                 <w:rFonts w:asciiTheme="majorBidi" w:hAnsiTheme="majorBidi" w:cstheme="majorBidi"/>
                 <w:szCs w:val="22"/>
@@ -4344,6 +4467,7 @@
           </w:tcPr>
           <w:p>
             <w:pPr>
+              <w:jc w:val="center"/>
               <w:rPr>
                 <w:rFonts w:asciiTheme="majorBidi" w:hAnsiTheme="majorBidi" w:cstheme="majorBidi"/>
                 <w:szCs w:val="22"/>
@@ -4558,6 +4682,7 @@
           </w:tcPr>
           <w:p>
             <w:pPr>
+              <w:jc w:val="center"/>
               <w:rPr>
                 <w:rFonts w:asciiTheme="majorBidi" w:hAnsiTheme="majorBidi" w:cstheme="majorBidi"/>
                 <w:szCs w:val="22"/>
@@ -4755,6 +4880,7 @@
           </w:tcPr>
           <w:p>
             <w:pPr>
+              <w:jc w:val="center"/>
               <w:rPr>
                 <w:rFonts w:asciiTheme="majorBidi" w:hAnsiTheme="majorBidi" w:cstheme="majorBidi"/>
                 <w:szCs w:val="22"/>
@@ -5050,6 +5176,7 @@
           </w:tcPr>
           <w:p>
             <w:pPr>
+              <w:jc w:val="center"/>
               <w:rPr>
                 <w:rFonts w:asciiTheme="majorBidi" w:hAnsiTheme="majorBidi" w:cstheme="majorBidi"/>
                 <w:szCs w:val="22"/>
@@ -5213,6 +5340,7 @@
           </w:tcPr>
           <w:p>
             <w:pPr>
+              <w:jc w:val="center"/>
               <w:rPr>
                 <w:rFonts w:asciiTheme="majorBidi" w:hAnsiTheme="majorBidi" w:cstheme="majorBidi"/>
                 <w:szCs w:val="22"/>
@@ -5388,6 +5516,7 @@
           </w:tcPr>
           <w:p>
             <w:pPr>
+              <w:jc w:val="center"/>
               <w:rPr>
                 <w:rFonts w:asciiTheme="majorBidi" w:hAnsiTheme="majorBidi" w:cstheme="majorBidi"/>
                 <w:szCs w:val="22"/>
@@ -5696,6 +5825,7 @@
           </w:tcPr>
           <w:p>
             <w:pPr>
+              <w:jc w:val="center"/>
               <w:rPr>
                 <w:rFonts w:asciiTheme="majorBidi" w:hAnsiTheme="majorBidi" w:cstheme="majorBidi"/>
                 <w:szCs w:val="22"/>
@@ -5961,6 +6091,7 @@
           </w:tcPr>
           <w:p>
             <w:pPr>
+              <w:jc w:val="center"/>
               <w:rPr>
                 <w:rFonts w:asciiTheme="majorBidi" w:hAnsiTheme="majorBidi" w:cstheme="majorBidi"/>
                 <w:szCs w:val="22"/>
@@ -6320,6 +6451,7 @@
           </w:tcPr>
           <w:p>
             <w:pPr>
+              <w:jc w:val="center"/>
               <w:rPr>
                 <w:rFonts w:asciiTheme="majorBidi" w:hAnsiTheme="majorBidi" w:cstheme="majorBidi"/>
                 <w:szCs w:val="22"/>
@@ -6675,6 +6807,7 @@
           </w:tcPr>
           <w:p>
             <w:pPr>
+              <w:jc w:val="center"/>
               <w:rPr>
                 <w:rFonts w:asciiTheme="majorBidi" w:hAnsiTheme="majorBidi" w:cstheme="majorBidi"/>
                 <w:szCs w:val="22"/>
@@ -6860,6 +6993,7 @@
                 <w:szCs w:val="24"/>
               </w:rPr>
             </w:pPr>
+            <w:proofErr w:type="gramStart"/>
             <w:r>
               <w:rPr>
                 <w:rFonts w:asciiTheme="majorBidi" w:hAnsiTheme="majorBidi" w:cstheme="majorBidi"/>
@@ -6874,15 +7008,42 @@
                 <w:sz w:val="24"/>
                 <w:szCs w:val="24"/>
               </w:rPr>
-              <w:t xml:space="preserve">  Type 1          </w:t>
-            </w:r>
-            <w:r>
-              <w:rPr>
-                <w:rFonts w:asciiTheme="majorBidi" w:hAnsiTheme="majorBidi" w:cstheme="majorBidi"/>
-                <w:sz w:val="24"/>
-                <w:szCs w:val="24"/>
-              </w:rPr>
-              <w:t>{{</w:t>
+              <w:t xml:space="preserve">  Type</w:t>
+            </w:r>
+            <w:proofErr w:type="gramEnd"/>
+            <w:r>
+              <w:rPr>
+                <w:rFonts w:asciiTheme="majorBidi" w:hAnsiTheme="majorBidi" w:cstheme="majorBidi"/>
+                <w:sz w:val="24"/>
+                <w:szCs w:val="24"/>
+              </w:rPr>
+              <w:t xml:space="preserve"> 1       </w:t>
+            </w:r>
+            <w:proofErr w:type="gramStart"/>
+            <w:r>
+              <w:rPr>
+                <w:rFonts w:asciiTheme="majorBidi" w:hAnsiTheme="majorBidi" w:cstheme="majorBidi"/>
+                <w:sz w:val="24"/>
+                <w:szCs w:val="24"/>
+              </w:rPr>
+              <w:t xml:space="preserve">   </w:t>
+            </w:r>
+            <w:r>
+              <w:rPr>
+                <w:rFonts w:asciiTheme="majorBidi" w:hAnsiTheme="majorBidi" w:cstheme="majorBidi"/>
+                <w:sz w:val="24"/>
+                <w:szCs w:val="24"/>
+              </w:rPr>
+              <w:t>{</w:t>
+            </w:r>
+            <w:proofErr w:type="gramEnd"/>
+            <w:r>
+              <w:rPr>
+                <w:rFonts w:asciiTheme="majorBidi" w:hAnsiTheme="majorBidi" w:cstheme="majorBidi"/>
+                <w:sz w:val="24"/>
+                <w:szCs w:val="24"/>
+              </w:rPr>
+              <w:t>{</w:t>
             </w:r>
             <w:r>
               <w:rPr>
@@ -6902,6 +7063,7 @@
                 <w:cs/>
               </w:rPr>
             </w:pPr>
+            <w:proofErr w:type="gramStart"/>
             <w:r>
               <w:rPr>
                 <w:rFonts w:asciiTheme="majorBidi" w:hAnsiTheme="majorBidi" w:cstheme="majorBidi"/>
@@ -6916,7 +7078,16 @@
                 <w:sz w:val="24"/>
                 <w:szCs w:val="24"/>
               </w:rPr>
-              <w:t xml:space="preserve">  Type 2</w:t>
+              <w:t xml:space="preserve">  Type</w:t>
+            </w:r>
+            <w:proofErr w:type="gramEnd"/>
+            <w:r>
+              <w:rPr>
+                <w:rFonts w:asciiTheme="majorBidi" w:hAnsiTheme="majorBidi" w:cstheme="majorBidi"/>
+                <w:sz w:val="24"/>
+                <w:szCs w:val="24"/>
+              </w:rPr>
+              <w:t xml:space="preserve"> 2</w:t>
             </w:r>
           </w:p>
         </w:tc>
@@ -6927,6 +7098,7 @@
           </w:tcPr>
           <w:p>
             <w:pPr>
+              <w:jc w:val="center"/>
               <w:rPr>
                 <w:rFonts w:asciiTheme="majorBidi" w:hAnsiTheme="majorBidi" w:cstheme="majorBidi"/>
                 <w:szCs w:val="22"/>
@@ -7122,6 +7294,7 @@
           </w:tcPr>
           <w:p>
             <w:pPr>
+              <w:jc w:val="center"/>
               <w:rPr>
                 <w:rFonts w:asciiTheme="majorBidi" w:hAnsiTheme="majorBidi" w:cstheme="majorBidi"/>
                 <w:szCs w:val="22"/>
@@ -7319,6 +7492,7 @@
           </w:tcPr>
           <w:p>
             <w:pPr>
+              <w:jc w:val="center"/>
               <w:rPr>
                 <w:rFonts w:asciiTheme="majorBidi" w:hAnsiTheme="majorBidi" w:cstheme="majorBidi"/>
                 <w:szCs w:val="22"/>
@@ -7480,6 +7654,7 @@
           </w:tcPr>
           <w:p>
             <w:pPr>
+              <w:jc w:val="center"/>
               <w:rPr>
                 <w:rFonts w:asciiTheme="majorBidi" w:hAnsiTheme="majorBidi" w:cstheme="majorBidi"/>
                 <w:szCs w:val="22"/>
@@ -7774,6 +7949,7 @@
           </w:tcPr>
           <w:p>
             <w:pPr>
+              <w:jc w:val="center"/>
               <w:rPr>
                 <w:rFonts w:asciiTheme="majorBidi" w:hAnsiTheme="majorBidi" w:cstheme="majorBidi"/>
                 <w:szCs w:val="22"/>
@@ -8004,6 +8180,7 @@
           </w:tcPr>
           <w:p>
             <w:pPr>
+              <w:jc w:val="center"/>
               <w:rPr>
                 <w:rFonts w:asciiTheme="majorBidi" w:hAnsiTheme="majorBidi" w:cstheme="majorBidi"/>
                 <w:szCs w:val="22"/>
@@ -8165,6 +8342,7 @@
           </w:tcPr>
           <w:p>
             <w:pPr>
+              <w:jc w:val="center"/>
               <w:rPr>
                 <w:rFonts w:asciiTheme="majorBidi" w:hAnsiTheme="majorBidi" w:cstheme="majorBidi"/>
                 <w:szCs w:val="22"/>
@@ -8360,6 +8538,7 @@
           </w:tcPr>
           <w:p>
             <w:pPr>
+              <w:jc w:val="center"/>
               <w:rPr>
                 <w:rFonts w:asciiTheme="majorBidi" w:hAnsiTheme="majorBidi" w:cstheme="majorBidi"/>
                 <w:szCs w:val="22"/>
@@ -8513,6 +8692,7 @@
           </w:tcPr>
           <w:p>
             <w:pPr>
+              <w:jc w:val="center"/>
               <w:rPr>
                 <w:rFonts w:asciiTheme="majorBidi" w:hAnsiTheme="majorBidi" w:cstheme="majorBidi"/>
                 <w:szCs w:val="22"/>
@@ -8941,6 +9121,7 @@
               </w:rPr>
               <w:t>_ON</w:t>
             </w:r>
+            <w:proofErr w:type="gramStart"/>
             <w:r>
               <w:rPr>
                 <w:rFonts w:asciiTheme="majorBidi" w:hAnsiTheme="majorBidi" w:cstheme="majorBidi"/>
@@ -8957,6 +9138,7 @@
               </w:rPr>
               <w:t>ON</w:t>
             </w:r>
+            <w:proofErr w:type="gramEnd"/>
           </w:p>
         </w:tc>
         <w:tc>
@@ -8979,7 +9161,16 @@
                 <w:sz w:val="24"/>
                 <w:szCs w:val="24"/>
               </w:rPr>
-              <w:t>{{POW_OFF}}</w:t>
+              <w:t>{{POW_OFF</w:t>
+            </w:r>
+            <w:proofErr w:type="gramStart"/>
+            <w:r>
+              <w:rPr>
+                <w:rFonts w:asciiTheme="majorBidi" w:hAnsiTheme="majorBidi" w:cstheme="majorBidi"/>
+                <w:sz w:val="24"/>
+                <w:szCs w:val="24"/>
+              </w:rPr>
+              <w:t>}}</w:t>
             </w:r>
             <w:r>
               <w:rPr>
@@ -8989,6 +9180,7 @@
               </w:rPr>
               <w:t>OFF</w:t>
             </w:r>
+            <w:proofErr w:type="gramEnd"/>
           </w:p>
         </w:tc>
         <w:tc>
@@ -9011,7 +9203,16 @@
                 <w:sz w:val="24"/>
                 <w:szCs w:val="24"/>
               </w:rPr>
-              <w:t>{{POW_BLINK}}</w:t>
+              <w:t>{{POW_BLINK</w:t>
+            </w:r>
+            <w:proofErr w:type="gramStart"/>
+            <w:r>
+              <w:rPr>
+                <w:rFonts w:asciiTheme="majorBidi" w:hAnsiTheme="majorBidi" w:cstheme="majorBidi"/>
+                <w:sz w:val="24"/>
+                <w:szCs w:val="24"/>
+              </w:rPr>
+              <w:t>}}</w:t>
             </w:r>
             <w:r>
               <w:rPr>
@@ -9021,6 +9222,7 @@
               </w:rPr>
               <w:t>BLINK</w:t>
             </w:r>
+            <w:proofErr w:type="gramEnd"/>
           </w:p>
         </w:tc>
         <w:tc>
@@ -9137,7 +9339,16 @@
                 <w:sz w:val="24"/>
                 <w:szCs w:val="24"/>
               </w:rPr>
-              <w:t>{{ERR_ON}}</w:t>
+              <w:t>{{ERR_ON</w:t>
+            </w:r>
+            <w:proofErr w:type="gramStart"/>
+            <w:r>
+              <w:rPr>
+                <w:rFonts w:asciiTheme="majorBidi" w:hAnsiTheme="majorBidi" w:cstheme="majorBidi"/>
+                <w:sz w:val="24"/>
+                <w:szCs w:val="24"/>
+              </w:rPr>
+              <w:t>}}</w:t>
             </w:r>
             <w:r>
               <w:rPr>
@@ -9147,6 +9358,7 @@
               </w:rPr>
               <w:t>ON</w:t>
             </w:r>
+            <w:proofErr w:type="gramEnd"/>
           </w:p>
         </w:tc>
         <w:tc>
@@ -9169,7 +9381,16 @@
                 <w:sz w:val="24"/>
                 <w:szCs w:val="24"/>
               </w:rPr>
-              <w:t>{{ERR_OFF}}</w:t>
+              <w:t>{{ERR_OFF</w:t>
+            </w:r>
+            <w:proofErr w:type="gramStart"/>
+            <w:r>
+              <w:rPr>
+                <w:rFonts w:asciiTheme="majorBidi" w:hAnsiTheme="majorBidi" w:cstheme="majorBidi"/>
+                <w:sz w:val="24"/>
+                <w:szCs w:val="24"/>
+              </w:rPr>
+              <w:t>}}</w:t>
             </w:r>
             <w:r>
               <w:rPr>
@@ -9179,6 +9400,7 @@
               </w:rPr>
               <w:t>OFF</w:t>
             </w:r>
+            <w:proofErr w:type="gramEnd"/>
           </w:p>
         </w:tc>
         <w:tc>
@@ -9201,7 +9423,16 @@
                 <w:sz w:val="24"/>
                 <w:szCs w:val="24"/>
               </w:rPr>
-              <w:t>{{ERR_BLINK}}</w:t>
+              <w:t>{{ERR_BLINK</w:t>
+            </w:r>
+            <w:proofErr w:type="gramStart"/>
+            <w:r>
+              <w:rPr>
+                <w:rFonts w:asciiTheme="majorBidi" w:hAnsiTheme="majorBidi" w:cstheme="majorBidi"/>
+                <w:sz w:val="24"/>
+                <w:szCs w:val="24"/>
+              </w:rPr>
+              <w:t>}}</w:t>
             </w:r>
             <w:r>
               <w:rPr>
@@ -9211,6 +9442,7 @@
               </w:rPr>
               <w:t>BLINK</w:t>
             </w:r>
+            <w:proofErr w:type="gramEnd"/>
           </w:p>
         </w:tc>
         <w:tc>
@@ -9327,7 +9559,16 @@
                 <w:sz w:val="24"/>
                 <w:szCs w:val="24"/>
               </w:rPr>
-              <w:t>{{TX_ON}}</w:t>
+              <w:t>{{TX_ON</w:t>
+            </w:r>
+            <w:proofErr w:type="gramStart"/>
+            <w:r>
+              <w:rPr>
+                <w:rFonts w:asciiTheme="majorBidi" w:hAnsiTheme="majorBidi" w:cstheme="majorBidi"/>
+                <w:sz w:val="24"/>
+                <w:szCs w:val="24"/>
+              </w:rPr>
+              <w:t>}}</w:t>
             </w:r>
             <w:r>
               <w:rPr>
@@ -9337,6 +9578,7 @@
               </w:rPr>
               <w:t>ON</w:t>
             </w:r>
+            <w:proofErr w:type="gramEnd"/>
           </w:p>
         </w:tc>
         <w:tc>
@@ -9359,7 +9601,16 @@
                 <w:sz w:val="24"/>
                 <w:szCs w:val="24"/>
               </w:rPr>
-              <w:t>{{TX_OFF}}</w:t>
+              <w:t>{{TX_OFF</w:t>
+            </w:r>
+            <w:proofErr w:type="gramStart"/>
+            <w:r>
+              <w:rPr>
+                <w:rFonts w:asciiTheme="majorBidi" w:hAnsiTheme="majorBidi" w:cstheme="majorBidi"/>
+                <w:sz w:val="24"/>
+                <w:szCs w:val="24"/>
+              </w:rPr>
+              <w:t>}}</w:t>
             </w:r>
             <w:r>
               <w:rPr>
@@ -9369,6 +9620,7 @@
               </w:rPr>
               <w:t>OFF</w:t>
             </w:r>
+            <w:proofErr w:type="gramEnd"/>
           </w:p>
         </w:tc>
         <w:tc>
@@ -9391,7 +9643,16 @@
                 <w:sz w:val="24"/>
                 <w:szCs w:val="24"/>
               </w:rPr>
-              <w:t>{{TX_BLINK}}</w:t>
+              <w:t>{{TX_BLINK</w:t>
+            </w:r>
+            <w:proofErr w:type="gramStart"/>
+            <w:r>
+              <w:rPr>
+                <w:rFonts w:asciiTheme="majorBidi" w:hAnsiTheme="majorBidi" w:cstheme="majorBidi"/>
+                <w:sz w:val="24"/>
+                <w:szCs w:val="24"/>
+              </w:rPr>
+              <w:t>}}</w:t>
             </w:r>
             <w:r>
               <w:rPr>
@@ -9401,6 +9662,7 @@
               </w:rPr>
               <w:t>BLINK</w:t>
             </w:r>
+            <w:proofErr w:type="gramEnd"/>
           </w:p>
         </w:tc>
         <w:tc>
@@ -9517,7 +9779,16 @@
                 <w:sz w:val="24"/>
                 <w:szCs w:val="24"/>
               </w:rPr>
-              <w:t>{{RX_ON}}</w:t>
+              <w:t>{{RX_ON</w:t>
+            </w:r>
+            <w:proofErr w:type="gramStart"/>
+            <w:r>
+              <w:rPr>
+                <w:rFonts w:asciiTheme="majorBidi" w:hAnsiTheme="majorBidi" w:cstheme="majorBidi"/>
+                <w:sz w:val="24"/>
+                <w:szCs w:val="24"/>
+              </w:rPr>
+              <w:t>}}</w:t>
             </w:r>
             <w:r>
               <w:rPr>
@@ -9527,6 +9798,7 @@
               </w:rPr>
               <w:t>ON</w:t>
             </w:r>
+            <w:proofErr w:type="gramEnd"/>
           </w:p>
         </w:tc>
         <w:tc>
@@ -9549,7 +9821,16 @@
                 <w:sz w:val="24"/>
                 <w:szCs w:val="24"/>
               </w:rPr>
-              <w:t>{{RX_OFF}}</w:t>
+              <w:t>{{RX_OFF</w:t>
+            </w:r>
+            <w:proofErr w:type="gramStart"/>
+            <w:r>
+              <w:rPr>
+                <w:rFonts w:asciiTheme="majorBidi" w:hAnsiTheme="majorBidi" w:cstheme="majorBidi"/>
+                <w:sz w:val="24"/>
+                <w:szCs w:val="24"/>
+              </w:rPr>
+              <w:t>}}</w:t>
             </w:r>
             <w:r>
               <w:rPr>
@@ -9559,6 +9840,7 @@
               </w:rPr>
               <w:t>OFF</w:t>
             </w:r>
+            <w:proofErr w:type="gramEnd"/>
           </w:p>
         </w:tc>
         <w:tc>
@@ -9581,7 +9863,16 @@
                 <w:sz w:val="24"/>
                 <w:szCs w:val="24"/>
               </w:rPr>
-              <w:t>{{RX_BLINK}}</w:t>
+              <w:t>{{RX_BLINK</w:t>
+            </w:r>
+            <w:proofErr w:type="gramStart"/>
+            <w:r>
+              <w:rPr>
+                <w:rFonts w:asciiTheme="majorBidi" w:hAnsiTheme="majorBidi" w:cstheme="majorBidi"/>
+                <w:sz w:val="24"/>
+                <w:szCs w:val="24"/>
+              </w:rPr>
+              <w:t>}}</w:t>
             </w:r>
             <w:r>
               <w:rPr>
@@ -9591,6 +9882,7 @@
               </w:rPr>
               <w:t>BLINK</w:t>
             </w:r>
+            <w:proofErr w:type="gramEnd"/>
           </w:p>
         </w:tc>
         <w:tc>
@@ -9707,7 +9999,16 @@
                 <w:sz w:val="24"/>
                 <w:szCs w:val="24"/>
               </w:rPr>
-              <w:t>{{MVB_ON}}</w:t>
+              <w:t>{{MVB_ON</w:t>
+            </w:r>
+            <w:proofErr w:type="gramStart"/>
+            <w:r>
+              <w:rPr>
+                <w:rFonts w:asciiTheme="majorBidi" w:hAnsiTheme="majorBidi" w:cstheme="majorBidi"/>
+                <w:sz w:val="24"/>
+                <w:szCs w:val="24"/>
+              </w:rPr>
+              <w:t>}}</w:t>
             </w:r>
             <w:r>
               <w:rPr>
@@ -9717,6 +10018,7 @@
               </w:rPr>
               <w:t>ON</w:t>
             </w:r>
+            <w:proofErr w:type="gramEnd"/>
           </w:p>
         </w:tc>
         <w:tc>
@@ -9739,7 +10041,16 @@
                 <w:sz w:val="24"/>
                 <w:szCs w:val="24"/>
               </w:rPr>
-              <w:t>{{MVB_OFF}}</w:t>
+              <w:t>{{MVB_OFF</w:t>
+            </w:r>
+            <w:proofErr w:type="gramStart"/>
+            <w:r>
+              <w:rPr>
+                <w:rFonts w:asciiTheme="majorBidi" w:hAnsiTheme="majorBidi" w:cstheme="majorBidi"/>
+                <w:sz w:val="24"/>
+                <w:szCs w:val="24"/>
+              </w:rPr>
+              <w:t>}}</w:t>
             </w:r>
             <w:r>
               <w:rPr>
@@ -9749,6 +10060,7 @@
               </w:rPr>
               <w:t>OFF</w:t>
             </w:r>
+            <w:proofErr w:type="gramEnd"/>
           </w:p>
         </w:tc>
         <w:tc>
@@ -9771,7 +10083,16 @@
                 <w:sz w:val="24"/>
                 <w:szCs w:val="24"/>
               </w:rPr>
-              <w:t>{{MVB_BLINK}}</w:t>
+              <w:t>{{MVB_BLINK</w:t>
+            </w:r>
+            <w:proofErr w:type="gramStart"/>
+            <w:r>
+              <w:rPr>
+                <w:rFonts w:asciiTheme="majorBidi" w:hAnsiTheme="majorBidi" w:cstheme="majorBidi"/>
+                <w:sz w:val="24"/>
+                <w:szCs w:val="24"/>
+              </w:rPr>
+              <w:t>}}</w:t>
             </w:r>
             <w:r>
               <w:rPr>
@@ -9781,6 +10102,7 @@
               </w:rPr>
               <w:t>BLINK</w:t>
             </w:r>
+            <w:proofErr w:type="gramEnd"/>
           </w:p>
         </w:tc>
         <w:tc>
@@ -9897,7 +10219,16 @@
                 <w:sz w:val="24"/>
                 <w:szCs w:val="24"/>
               </w:rPr>
-              <w:t>{{SC_ON}}</w:t>
+              <w:t>{{SC_ON</w:t>
+            </w:r>
+            <w:proofErr w:type="gramStart"/>
+            <w:r>
+              <w:rPr>
+                <w:rFonts w:asciiTheme="majorBidi" w:hAnsiTheme="majorBidi" w:cstheme="majorBidi"/>
+                <w:sz w:val="24"/>
+                <w:szCs w:val="24"/>
+              </w:rPr>
+              <w:t>}}</w:t>
             </w:r>
             <w:r>
               <w:rPr>
@@ -9907,6 +10238,7 @@
               </w:rPr>
               <w:t>ON</w:t>
             </w:r>
+            <w:proofErr w:type="gramEnd"/>
           </w:p>
         </w:tc>
         <w:tc>
@@ -9929,7 +10261,16 @@
                 <w:sz w:val="24"/>
                 <w:szCs w:val="24"/>
               </w:rPr>
-              <w:t>{{SC_OFF}}</w:t>
+              <w:t>{{SC_OFF</w:t>
+            </w:r>
+            <w:proofErr w:type="gramStart"/>
+            <w:r>
+              <w:rPr>
+                <w:rFonts w:asciiTheme="majorBidi" w:hAnsiTheme="majorBidi" w:cstheme="majorBidi"/>
+                <w:sz w:val="24"/>
+                <w:szCs w:val="24"/>
+              </w:rPr>
+              <w:t>}}</w:t>
             </w:r>
             <w:r>
               <w:rPr>
@@ -9939,6 +10280,7 @@
               </w:rPr>
               <w:t>OFF</w:t>
             </w:r>
+            <w:proofErr w:type="gramEnd"/>
           </w:p>
         </w:tc>
         <w:tc>
@@ -9961,7 +10303,16 @@
                 <w:sz w:val="24"/>
                 <w:szCs w:val="24"/>
               </w:rPr>
-              <w:t>{{SC_BLINK}}</w:t>
+              <w:t>{{SC_BLINK</w:t>
+            </w:r>
+            <w:proofErr w:type="gramStart"/>
+            <w:r>
+              <w:rPr>
+                <w:rFonts w:asciiTheme="majorBidi" w:hAnsiTheme="majorBidi" w:cstheme="majorBidi"/>
+                <w:sz w:val="24"/>
+                <w:szCs w:val="24"/>
+              </w:rPr>
+              <w:t>}}</w:t>
             </w:r>
             <w:r>
               <w:rPr>
@@ -9971,6 +10322,7 @@
               </w:rPr>
               <w:t>BLINK</w:t>
             </w:r>
+            <w:proofErr w:type="gramEnd"/>
           </w:p>
         </w:tc>
         <w:tc>
@@ -10087,7 +10439,16 @@
                 <w:sz w:val="24"/>
                 <w:szCs w:val="24"/>
               </w:rPr>
-              <w:t>{{WA_ON}}</w:t>
+              <w:t>{{WA_ON</w:t>
+            </w:r>
+            <w:proofErr w:type="gramStart"/>
+            <w:r>
+              <w:rPr>
+                <w:rFonts w:asciiTheme="majorBidi" w:hAnsiTheme="majorBidi" w:cstheme="majorBidi"/>
+                <w:sz w:val="24"/>
+                <w:szCs w:val="24"/>
+              </w:rPr>
+              <w:t>}}</w:t>
             </w:r>
             <w:r>
               <w:rPr>
@@ -10097,6 +10458,7 @@
               </w:rPr>
               <w:t>ON</w:t>
             </w:r>
+            <w:proofErr w:type="gramEnd"/>
           </w:p>
         </w:tc>
         <w:tc>
@@ -10119,7 +10481,16 @@
                 <w:sz w:val="24"/>
                 <w:szCs w:val="24"/>
               </w:rPr>
-              <w:t>{{WA_OFF}}</w:t>
+              <w:t>{{WA_OFF</w:t>
+            </w:r>
+            <w:proofErr w:type="gramStart"/>
+            <w:r>
+              <w:rPr>
+                <w:rFonts w:asciiTheme="majorBidi" w:hAnsiTheme="majorBidi" w:cstheme="majorBidi"/>
+                <w:sz w:val="24"/>
+                <w:szCs w:val="24"/>
+              </w:rPr>
+              <w:t>}}</w:t>
             </w:r>
             <w:r>
               <w:rPr>
@@ -10129,6 +10500,7 @@
               </w:rPr>
               <w:t>OFF</w:t>
             </w:r>
+            <w:proofErr w:type="gramEnd"/>
           </w:p>
         </w:tc>
         <w:tc>
@@ -10151,7 +10523,16 @@
                 <w:sz w:val="24"/>
                 <w:szCs w:val="24"/>
               </w:rPr>
-              <w:t>{{WA_BLINK}}</w:t>
+              <w:t>{{WA_BLINK</w:t>
+            </w:r>
+            <w:proofErr w:type="gramStart"/>
+            <w:r>
+              <w:rPr>
+                <w:rFonts w:asciiTheme="majorBidi" w:hAnsiTheme="majorBidi" w:cstheme="majorBidi"/>
+                <w:sz w:val="24"/>
+                <w:szCs w:val="24"/>
+              </w:rPr>
+              <w:t>}}</w:t>
             </w:r>
             <w:r>
               <w:rPr>
@@ -10161,6 +10542,7 @@
               </w:rPr>
               <w:t>BLINK</w:t>
             </w:r>
+            <w:proofErr w:type="gramEnd"/>
           </w:p>
         </w:tc>
         <w:tc>
@@ -10277,7 +10659,16 @@
                 <w:sz w:val="24"/>
                 <w:szCs w:val="24"/>
               </w:rPr>
-              <w:t>{{RTS_ON}}</w:t>
+              <w:t>{{RTS_ON</w:t>
+            </w:r>
+            <w:proofErr w:type="gramStart"/>
+            <w:r>
+              <w:rPr>
+                <w:rFonts w:asciiTheme="majorBidi" w:hAnsiTheme="majorBidi" w:cstheme="majorBidi"/>
+                <w:sz w:val="24"/>
+                <w:szCs w:val="24"/>
+              </w:rPr>
+              <w:t>}}</w:t>
             </w:r>
             <w:r>
               <w:rPr>
@@ -10287,6 +10678,7 @@
               </w:rPr>
               <w:t>ON</w:t>
             </w:r>
+            <w:proofErr w:type="gramEnd"/>
           </w:p>
         </w:tc>
         <w:tc>
@@ -10309,7 +10701,16 @@
                 <w:sz w:val="24"/>
                 <w:szCs w:val="24"/>
               </w:rPr>
-              <w:t>{{RTS_OFF}}</w:t>
+              <w:t>{{RTS_OFF</w:t>
+            </w:r>
+            <w:proofErr w:type="gramStart"/>
+            <w:r>
+              <w:rPr>
+                <w:rFonts w:asciiTheme="majorBidi" w:hAnsiTheme="majorBidi" w:cstheme="majorBidi"/>
+                <w:sz w:val="24"/>
+                <w:szCs w:val="24"/>
+              </w:rPr>
+              <w:t>}}</w:t>
             </w:r>
             <w:r>
               <w:rPr>
@@ -10319,6 +10720,7 @@
               </w:rPr>
               <w:t>OFF</w:t>
             </w:r>
+            <w:proofErr w:type="gramEnd"/>
           </w:p>
         </w:tc>
         <w:tc>
@@ -10341,7 +10743,16 @@
                 <w:sz w:val="24"/>
                 <w:szCs w:val="24"/>
               </w:rPr>
-              <w:t>{{RTS_BLINK}}</w:t>
+              <w:t>{{RTS_BLINK</w:t>
+            </w:r>
+            <w:proofErr w:type="gramStart"/>
+            <w:r>
+              <w:rPr>
+                <w:rFonts w:asciiTheme="majorBidi" w:hAnsiTheme="majorBidi" w:cstheme="majorBidi"/>
+                <w:sz w:val="24"/>
+                <w:szCs w:val="24"/>
+              </w:rPr>
+              <w:t>}}</w:t>
             </w:r>
             <w:r>
               <w:rPr>
@@ -10351,6 +10762,7 @@
               </w:rPr>
               <w:t>BLINK</w:t>
             </w:r>
+            <w:proofErr w:type="gramEnd"/>
           </w:p>
         </w:tc>
         <w:tc>
@@ -10629,6 +11041,7 @@
               <w:t>input_result</w:t>
             </w:r>
             <w:proofErr w:type="spellEnd"/>
+            <w:proofErr w:type="gramStart"/>
             <w:r>
               <w:rPr>
                 <w:rFonts w:ascii="Angsana New" w:hAnsi="Angsana New" w:cs="Angsana New"/>
@@ -10645,6 +11058,7 @@
               </w:rPr>
               <w:t>Vac</w:t>
             </w:r>
+            <w:proofErr w:type="gramEnd"/>
           </w:p>
         </w:tc>
         <w:tc>
@@ -10775,6 +11189,7 @@
               <w:t>output_result</w:t>
             </w:r>
             <w:proofErr w:type="spellEnd"/>
+            <w:proofErr w:type="gramStart"/>
             <w:r>
               <w:rPr>
                 <w:rFonts w:ascii="Angsana New" w:hAnsi="Angsana New" w:cs="Angsana New"/>
@@ -10791,6 +11206,7 @@
               </w:rPr>
               <w:t>Vdc</w:t>
             </w:r>
+            <w:proofErr w:type="gramEnd"/>
           </w:p>
         </w:tc>
         <w:tc>
@@ -11412,6 +11828,7 @@
           </w:tcPr>
           <w:p>
             <w:pPr>
+              <w:jc w:val="center"/>
               <w:rPr>
                 <w:rFonts w:asciiTheme="majorBidi" w:hAnsiTheme="majorBidi" w:cstheme="majorBidi"/>
                 <w:sz w:val="24"/>
@@ -11437,6 +11854,7 @@
           </w:tcPr>
           <w:p>
             <w:pPr>
+              <w:jc w:val="center"/>
               <w:rPr>
                 <w:rFonts w:asciiTheme="majorBidi" w:hAnsiTheme="majorBidi" w:cstheme="majorBidi"/>
                 <w:sz w:val="24"/>
@@ -11462,6 +11880,7 @@
           </w:tcPr>
           <w:p>
             <w:pPr>
+              <w:jc w:val="center"/>
               <w:rPr>
                 <w:rFonts w:asciiTheme="majorBidi" w:hAnsiTheme="majorBidi" w:cstheme="majorBidi"/>
                 <w:sz w:val="24"/>
@@ -11487,6 +11906,7 @@
           </w:tcPr>
           <w:p>
             <w:pPr>
+              <w:jc w:val="center"/>
               <w:rPr>
                 <w:rFonts w:asciiTheme="majorBidi" w:hAnsiTheme="majorBidi" w:cstheme="majorBidi"/>
                 <w:sz w:val="24"/>
@@ -11512,6 +11932,7 @@
           </w:tcPr>
           <w:p>
             <w:pPr>
+              <w:jc w:val="center"/>
               <w:rPr>
                 <w:rFonts w:asciiTheme="majorBidi" w:hAnsiTheme="majorBidi" w:cstheme="majorBidi"/>
                 <w:sz w:val="24"/>
@@ -11537,6 +11958,7 @@
           </w:tcPr>
           <w:p>
             <w:pPr>
+              <w:jc w:val="center"/>
               <w:rPr>
                 <w:rFonts w:asciiTheme="majorBidi" w:hAnsiTheme="majorBidi" w:cstheme="majorBidi"/>
                 <w:sz w:val="24"/>
@@ -11562,6 +11984,7 @@
           </w:tcPr>
           <w:p>
             <w:pPr>
+              <w:jc w:val="center"/>
               <w:rPr>
                 <w:rFonts w:asciiTheme="majorBidi" w:hAnsiTheme="majorBidi" w:cstheme="majorBidi"/>
                 <w:sz w:val="24"/>
@@ -11587,6 +12010,7 @@
           </w:tcPr>
           <w:p>
             <w:pPr>
+              <w:jc w:val="center"/>
               <w:rPr>
                 <w:rFonts w:asciiTheme="majorBidi" w:hAnsiTheme="majorBidi" w:cstheme="majorBidi"/>
                 <w:sz w:val="24"/>
@@ -11655,6 +12079,7 @@
           </w:tcPr>
           <w:p>
             <w:pPr>
+              <w:jc w:val="center"/>
               <w:rPr>
                 <w:rFonts w:asciiTheme="majorBidi" w:hAnsiTheme="majorBidi" w:cstheme="majorBidi"/>
                 <w:sz w:val="24"/>
@@ -11680,6 +12105,7 @@
           </w:tcPr>
           <w:p>
             <w:pPr>
+              <w:jc w:val="center"/>
               <w:rPr>
                 <w:rFonts w:asciiTheme="majorBidi" w:hAnsiTheme="majorBidi" w:cstheme="majorBidi"/>
                 <w:sz w:val="24"/>
@@ -11705,6 +12131,7 @@
           </w:tcPr>
           <w:p>
             <w:pPr>
+              <w:jc w:val="center"/>
               <w:rPr>
                 <w:rFonts w:asciiTheme="majorBidi" w:hAnsiTheme="majorBidi" w:cstheme="majorBidi"/>
                 <w:sz w:val="24"/>
@@ -11730,6 +12157,7 @@
           </w:tcPr>
           <w:p>
             <w:pPr>
+              <w:jc w:val="center"/>
               <w:rPr>
                 <w:rFonts w:asciiTheme="majorBidi" w:hAnsiTheme="majorBidi" w:cstheme="majorBidi"/>
                 <w:sz w:val="24"/>
@@ -11755,6 +12183,7 @@
           </w:tcPr>
           <w:p>
             <w:pPr>
+              <w:jc w:val="center"/>
               <w:rPr>
                 <w:rFonts w:asciiTheme="majorBidi" w:hAnsiTheme="majorBidi" w:cstheme="majorBidi"/>
                 <w:sz w:val="24"/>
@@ -11780,6 +12209,7 @@
           </w:tcPr>
           <w:p>
             <w:pPr>
+              <w:jc w:val="center"/>
               <w:rPr>
                 <w:rFonts w:asciiTheme="majorBidi" w:hAnsiTheme="majorBidi" w:cstheme="majorBidi"/>
                 <w:sz w:val="24"/>
@@ -11805,6 +12235,7 @@
           </w:tcPr>
           <w:p>
             <w:pPr>
+              <w:jc w:val="center"/>
               <w:rPr>
                 <w:rFonts w:asciiTheme="majorBidi" w:hAnsiTheme="majorBidi" w:cstheme="majorBidi"/>
                 <w:sz w:val="24"/>
@@ -11830,6 +12261,7 @@
           </w:tcPr>
           <w:p>
             <w:pPr>
+              <w:jc w:val="center"/>
               <w:rPr>
                 <w:rFonts w:asciiTheme="majorBidi" w:hAnsiTheme="majorBidi" w:cstheme="majorBidi"/>
                 <w:sz w:val="24"/>
@@ -11898,6 +12330,7 @@
           </w:tcPr>
           <w:p>
             <w:pPr>
+              <w:jc w:val="center"/>
               <w:rPr>
                 <w:rFonts w:asciiTheme="majorBidi" w:hAnsiTheme="majorBidi" w:cstheme="majorBidi"/>
                 <w:sz w:val="24"/>
@@ -11923,6 +12356,7 @@
           </w:tcPr>
           <w:p>
             <w:pPr>
+              <w:jc w:val="center"/>
               <w:rPr>
                 <w:rFonts w:asciiTheme="majorBidi" w:hAnsiTheme="majorBidi" w:cstheme="majorBidi"/>
                 <w:sz w:val="24"/>
@@ -11948,6 +12382,7 @@
           </w:tcPr>
           <w:p>
             <w:pPr>
+              <w:jc w:val="center"/>
               <w:rPr>
                 <w:rFonts w:asciiTheme="majorBidi" w:hAnsiTheme="majorBidi" w:cstheme="majorBidi"/>
                 <w:sz w:val="24"/>
@@ -11973,6 +12408,7 @@
           </w:tcPr>
           <w:p>
             <w:pPr>
+              <w:jc w:val="center"/>
               <w:rPr>
                 <w:rFonts w:asciiTheme="majorBidi" w:hAnsiTheme="majorBidi" w:cstheme="majorBidi"/>
                 <w:sz w:val="24"/>
@@ -11998,6 +12434,7 @@
           </w:tcPr>
           <w:p>
             <w:pPr>
+              <w:jc w:val="center"/>
               <w:rPr>
                 <w:rFonts w:asciiTheme="majorBidi" w:hAnsiTheme="majorBidi" w:cstheme="majorBidi"/>
                 <w:sz w:val="24"/>
@@ -12023,6 +12460,7 @@
           </w:tcPr>
           <w:p>
             <w:pPr>
+              <w:jc w:val="center"/>
               <w:rPr>
                 <w:rFonts w:asciiTheme="majorBidi" w:hAnsiTheme="majorBidi" w:cstheme="majorBidi"/>
                 <w:sz w:val="24"/>
@@ -12048,6 +12486,7 @@
           </w:tcPr>
           <w:p>
             <w:pPr>
+              <w:jc w:val="center"/>
               <w:rPr>
                 <w:rFonts w:asciiTheme="majorBidi" w:hAnsiTheme="majorBidi" w:cstheme="majorBidi"/>
                 <w:sz w:val="24"/>
@@ -12073,6 +12512,7 @@
           </w:tcPr>
           <w:p>
             <w:pPr>
+              <w:jc w:val="center"/>
               <w:rPr>
                 <w:rFonts w:asciiTheme="majorBidi" w:hAnsiTheme="majorBidi" w:cstheme="majorBidi"/>
                 <w:sz w:val="24"/>
@@ -12141,6 +12581,7 @@
           </w:tcPr>
           <w:p>
             <w:pPr>
+              <w:jc w:val="center"/>
               <w:rPr>
                 <w:rFonts w:asciiTheme="majorBidi" w:hAnsiTheme="majorBidi" w:cstheme="majorBidi"/>
                 <w:sz w:val="24"/>
@@ -12166,6 +12607,7 @@
           </w:tcPr>
           <w:p>
             <w:pPr>
+              <w:jc w:val="center"/>
               <w:rPr>
                 <w:rFonts w:asciiTheme="majorBidi" w:hAnsiTheme="majorBidi" w:cstheme="majorBidi"/>
                 <w:sz w:val="24"/>
@@ -12191,6 +12633,7 @@
           </w:tcPr>
           <w:p>
             <w:pPr>
+              <w:jc w:val="center"/>
               <w:rPr>
                 <w:rFonts w:asciiTheme="majorBidi" w:hAnsiTheme="majorBidi" w:cstheme="majorBidi"/>
                 <w:sz w:val="24"/>
@@ -12216,6 +12659,7 @@
           </w:tcPr>
           <w:p>
             <w:pPr>
+              <w:jc w:val="center"/>
               <w:rPr>
                 <w:rFonts w:asciiTheme="majorBidi" w:hAnsiTheme="majorBidi" w:cstheme="majorBidi"/>
                 <w:sz w:val="24"/>
@@ -12241,6 +12685,7 @@
           </w:tcPr>
           <w:p>
             <w:pPr>
+              <w:jc w:val="center"/>
               <w:rPr>
                 <w:rFonts w:asciiTheme="majorBidi" w:hAnsiTheme="majorBidi" w:cstheme="majorBidi"/>
                 <w:sz w:val="24"/>
@@ -12266,6 +12711,7 @@
           </w:tcPr>
           <w:p>
             <w:pPr>
+              <w:jc w:val="center"/>
               <w:rPr>
                 <w:rFonts w:asciiTheme="majorBidi" w:hAnsiTheme="majorBidi" w:cstheme="majorBidi"/>
                 <w:sz w:val="24"/>
@@ -12291,6 +12737,7 @@
           </w:tcPr>
           <w:p>
             <w:pPr>
+              <w:jc w:val="center"/>
               <w:rPr>
                 <w:rFonts w:asciiTheme="majorBidi" w:hAnsiTheme="majorBidi" w:cstheme="majorBidi"/>
                 <w:sz w:val="24"/>
@@ -12316,6 +12763,7 @@
           </w:tcPr>
           <w:p>
             <w:pPr>
+              <w:jc w:val="center"/>
               <w:rPr>
                 <w:rFonts w:asciiTheme="majorBidi" w:hAnsiTheme="majorBidi" w:cstheme="majorBidi"/>
                 <w:sz w:val="24"/>
@@ -12384,6 +12832,7 @@
           </w:tcPr>
           <w:p>
             <w:pPr>
+              <w:jc w:val="center"/>
               <w:rPr>
                 <w:rFonts w:asciiTheme="majorBidi" w:hAnsiTheme="majorBidi" w:cstheme="majorBidi"/>
                 <w:sz w:val="24"/>
@@ -12409,6 +12858,7 @@
           </w:tcPr>
           <w:p>
             <w:pPr>
+              <w:jc w:val="center"/>
               <w:rPr>
                 <w:rFonts w:asciiTheme="majorBidi" w:hAnsiTheme="majorBidi" w:cstheme="majorBidi"/>
                 <w:sz w:val="24"/>
@@ -12434,6 +12884,7 @@
           </w:tcPr>
           <w:p>
             <w:pPr>
+              <w:jc w:val="center"/>
               <w:rPr>
                 <w:rFonts w:asciiTheme="majorBidi" w:hAnsiTheme="majorBidi" w:cstheme="majorBidi"/>
                 <w:sz w:val="24"/>
@@ -12459,6 +12910,7 @@
           </w:tcPr>
           <w:p>
             <w:pPr>
+              <w:jc w:val="center"/>
               <w:rPr>
                 <w:rFonts w:asciiTheme="majorBidi" w:hAnsiTheme="majorBidi" w:cstheme="majorBidi"/>
                 <w:sz w:val="24"/>
@@ -12484,6 +12936,7 @@
           </w:tcPr>
           <w:p>
             <w:pPr>
+              <w:jc w:val="center"/>
               <w:rPr>
                 <w:rFonts w:asciiTheme="majorBidi" w:hAnsiTheme="majorBidi" w:cstheme="majorBidi"/>
                 <w:sz w:val="24"/>
@@ -12509,6 +12962,7 @@
           </w:tcPr>
           <w:p>
             <w:pPr>
+              <w:jc w:val="center"/>
               <w:rPr>
                 <w:rFonts w:asciiTheme="majorBidi" w:hAnsiTheme="majorBidi" w:cstheme="majorBidi"/>
                 <w:sz w:val="24"/>
@@ -12534,6 +12988,7 @@
           </w:tcPr>
           <w:p>
             <w:pPr>
+              <w:jc w:val="center"/>
               <w:rPr>
                 <w:rFonts w:asciiTheme="majorBidi" w:hAnsiTheme="majorBidi" w:cstheme="majorBidi"/>
                 <w:sz w:val="24"/>
@@ -12559,6 +13014,7 @@
           </w:tcPr>
           <w:p>
             <w:pPr>
+              <w:jc w:val="center"/>
               <w:rPr>
                 <w:rFonts w:asciiTheme="majorBidi" w:hAnsiTheme="majorBidi" w:cstheme="majorBidi"/>
                 <w:sz w:val="24"/>
@@ -12627,6 +13083,7 @@
           </w:tcPr>
           <w:p>
             <w:pPr>
+              <w:jc w:val="center"/>
               <w:rPr>
                 <w:rFonts w:asciiTheme="majorBidi" w:hAnsiTheme="majorBidi" w:cstheme="majorBidi"/>
                 <w:sz w:val="24"/>
@@ -12652,6 +13109,7 @@
           </w:tcPr>
           <w:p>
             <w:pPr>
+              <w:jc w:val="center"/>
               <w:rPr>
                 <w:rFonts w:asciiTheme="majorBidi" w:hAnsiTheme="majorBidi" w:cstheme="majorBidi"/>
                 <w:sz w:val="24"/>
@@ -12677,6 +13135,7 @@
           </w:tcPr>
           <w:p>
             <w:pPr>
+              <w:jc w:val="center"/>
               <w:rPr>
                 <w:rFonts w:asciiTheme="majorBidi" w:hAnsiTheme="majorBidi" w:cstheme="majorBidi"/>
                 <w:sz w:val="24"/>
@@ -12702,6 +13161,7 @@
           </w:tcPr>
           <w:p>
             <w:pPr>
+              <w:jc w:val="center"/>
               <w:rPr>
                 <w:rFonts w:asciiTheme="majorBidi" w:hAnsiTheme="majorBidi" w:cstheme="majorBidi"/>
                 <w:sz w:val="24"/>
@@ -12727,6 +13187,7 @@
           </w:tcPr>
           <w:p>
             <w:pPr>
+              <w:jc w:val="center"/>
               <w:rPr>
                 <w:rFonts w:asciiTheme="majorBidi" w:hAnsiTheme="majorBidi" w:cstheme="majorBidi"/>
                 <w:sz w:val="24"/>
@@ -12752,6 +13213,7 @@
           </w:tcPr>
           <w:p>
             <w:pPr>
+              <w:jc w:val="center"/>
               <w:rPr>
                 <w:rFonts w:asciiTheme="majorBidi" w:hAnsiTheme="majorBidi" w:cstheme="majorBidi"/>
                 <w:sz w:val="24"/>
@@ -12777,6 +13239,7 @@
           </w:tcPr>
           <w:p>
             <w:pPr>
+              <w:jc w:val="center"/>
               <w:rPr>
                 <w:rFonts w:asciiTheme="majorBidi" w:hAnsiTheme="majorBidi" w:cstheme="majorBidi"/>
                 <w:sz w:val="24"/>
@@ -12802,6 +13265,7 @@
           </w:tcPr>
           <w:p>
             <w:pPr>
+              <w:jc w:val="center"/>
               <w:rPr>
                 <w:rFonts w:asciiTheme="majorBidi" w:hAnsiTheme="majorBidi" w:cstheme="majorBidi"/>
                 <w:sz w:val="24"/>
@@ -12870,6 +13334,7 @@
           </w:tcPr>
           <w:p>
             <w:pPr>
+              <w:jc w:val="center"/>
               <w:rPr>
                 <w:rFonts w:asciiTheme="majorBidi" w:hAnsiTheme="majorBidi" w:cstheme="majorBidi"/>
                 <w:sz w:val="24"/>
@@ -12895,6 +13360,7 @@
           </w:tcPr>
           <w:p>
             <w:pPr>
+              <w:jc w:val="center"/>
               <w:rPr>
                 <w:rFonts w:asciiTheme="majorBidi" w:hAnsiTheme="majorBidi" w:cstheme="majorBidi"/>
                 <w:sz w:val="24"/>
@@ -12920,6 +13386,7 @@
           </w:tcPr>
           <w:p>
             <w:pPr>
+              <w:jc w:val="center"/>
               <w:rPr>
                 <w:rFonts w:asciiTheme="majorBidi" w:hAnsiTheme="majorBidi" w:cstheme="majorBidi"/>
                 <w:sz w:val="24"/>
@@ -12945,6 +13412,7 @@
           </w:tcPr>
           <w:p>
             <w:pPr>
+              <w:jc w:val="center"/>
               <w:rPr>
                 <w:rFonts w:asciiTheme="majorBidi" w:hAnsiTheme="majorBidi" w:cstheme="majorBidi"/>
                 <w:sz w:val="24"/>
@@ -12970,6 +13438,7 @@
           </w:tcPr>
           <w:p>
             <w:pPr>
+              <w:jc w:val="center"/>
               <w:rPr>
                 <w:rFonts w:asciiTheme="majorBidi" w:hAnsiTheme="majorBidi" w:cstheme="majorBidi"/>
                 <w:sz w:val="24"/>
@@ -12995,6 +13464,7 @@
           </w:tcPr>
           <w:p>
             <w:pPr>
+              <w:jc w:val="center"/>
               <w:rPr>
                 <w:rFonts w:asciiTheme="majorBidi" w:hAnsiTheme="majorBidi" w:cstheme="majorBidi"/>
                 <w:sz w:val="24"/>
@@ -13020,6 +13490,7 @@
           </w:tcPr>
           <w:p>
             <w:pPr>
+              <w:jc w:val="center"/>
               <w:rPr>
                 <w:rFonts w:asciiTheme="majorBidi" w:hAnsiTheme="majorBidi" w:cstheme="majorBidi"/>
                 <w:sz w:val="24"/>
@@ -13045,6 +13516,7 @@
           </w:tcPr>
           <w:p>
             <w:pPr>
+              <w:jc w:val="center"/>
               <w:rPr>
                 <w:rFonts w:asciiTheme="majorBidi" w:hAnsiTheme="majorBidi" w:cstheme="majorBidi"/>
                 <w:sz w:val="24"/>
@@ -13113,6 +13585,7 @@
           </w:tcPr>
           <w:p>
             <w:pPr>
+              <w:jc w:val="center"/>
               <w:rPr>
                 <w:rFonts w:asciiTheme="majorBidi" w:hAnsiTheme="majorBidi" w:cstheme="majorBidi"/>
                 <w:sz w:val="24"/>
@@ -13138,6 +13611,7 @@
           </w:tcPr>
           <w:p>
             <w:pPr>
+              <w:jc w:val="center"/>
               <w:rPr>
                 <w:rFonts w:asciiTheme="majorBidi" w:hAnsiTheme="majorBidi" w:cstheme="majorBidi"/>
                 <w:sz w:val="24"/>
@@ -13163,6 +13637,7 @@
           </w:tcPr>
           <w:p>
             <w:pPr>
+              <w:jc w:val="center"/>
               <w:rPr>
                 <w:rFonts w:asciiTheme="majorBidi" w:hAnsiTheme="majorBidi" w:cstheme="majorBidi"/>
                 <w:sz w:val="24"/>
@@ -13188,6 +13663,7 @@
           </w:tcPr>
           <w:p>
             <w:pPr>
+              <w:jc w:val="center"/>
               <w:rPr>
                 <w:rFonts w:asciiTheme="majorBidi" w:hAnsiTheme="majorBidi" w:cstheme="majorBidi"/>
                 <w:sz w:val="24"/>
@@ -13213,6 +13689,7 @@
           </w:tcPr>
           <w:p>
             <w:pPr>
+              <w:jc w:val="center"/>
               <w:rPr>
                 <w:rFonts w:asciiTheme="majorBidi" w:hAnsiTheme="majorBidi" w:cstheme="majorBidi"/>
                 <w:sz w:val="24"/>
@@ -13238,6 +13715,7 @@
           </w:tcPr>
           <w:p>
             <w:pPr>
+              <w:jc w:val="center"/>
               <w:rPr>
                 <w:rFonts w:asciiTheme="majorBidi" w:hAnsiTheme="majorBidi" w:cstheme="majorBidi"/>
                 <w:sz w:val="24"/>
@@ -13263,6 +13741,7 @@
           </w:tcPr>
           <w:p>
             <w:pPr>
+              <w:jc w:val="center"/>
               <w:rPr>
                 <w:rFonts w:asciiTheme="majorBidi" w:hAnsiTheme="majorBidi" w:cstheme="majorBidi"/>
                 <w:sz w:val="24"/>
@@ -13288,6 +13767,7 @@
           </w:tcPr>
           <w:p>
             <w:pPr>
+              <w:jc w:val="center"/>
               <w:rPr>
                 <w:rFonts w:asciiTheme="majorBidi" w:hAnsiTheme="majorBidi" w:cstheme="majorBidi"/>
                 <w:sz w:val="24"/>
@@ -13356,6 +13836,7 @@
           </w:tcPr>
           <w:p>
             <w:pPr>
+              <w:jc w:val="center"/>
               <w:rPr>
                 <w:rFonts w:asciiTheme="majorBidi" w:hAnsiTheme="majorBidi" w:cstheme="majorBidi"/>
                 <w:sz w:val="24"/>
@@ -13381,6 +13862,7 @@
           </w:tcPr>
           <w:p>
             <w:pPr>
+              <w:jc w:val="center"/>
               <w:rPr>
                 <w:rFonts w:asciiTheme="majorBidi" w:hAnsiTheme="majorBidi" w:cstheme="majorBidi"/>
                 <w:sz w:val="24"/>
@@ -13406,6 +13888,7 @@
           </w:tcPr>
           <w:p>
             <w:pPr>
+              <w:jc w:val="center"/>
               <w:rPr>
                 <w:rFonts w:asciiTheme="majorBidi" w:hAnsiTheme="majorBidi" w:cstheme="majorBidi"/>
                 <w:sz w:val="24"/>
@@ -13431,6 +13914,7 @@
           </w:tcPr>
           <w:p>
             <w:pPr>
+              <w:jc w:val="center"/>
               <w:rPr>
                 <w:rFonts w:asciiTheme="majorBidi" w:hAnsiTheme="majorBidi" w:cstheme="majorBidi"/>
                 <w:sz w:val="24"/>
@@ -13456,6 +13940,7 @@
           </w:tcPr>
           <w:p>
             <w:pPr>
+              <w:jc w:val="center"/>
               <w:rPr>
                 <w:rFonts w:asciiTheme="majorBidi" w:hAnsiTheme="majorBidi" w:cstheme="majorBidi"/>
                 <w:sz w:val="24"/>
@@ -13481,6 +13966,7 @@
           </w:tcPr>
           <w:p>
             <w:pPr>
+              <w:jc w:val="center"/>
               <w:rPr>
                 <w:rFonts w:asciiTheme="majorBidi" w:hAnsiTheme="majorBidi" w:cstheme="majorBidi"/>
                 <w:sz w:val="24"/>
@@ -13506,6 +13992,7 @@
           </w:tcPr>
           <w:p>
             <w:pPr>
+              <w:jc w:val="center"/>
               <w:rPr>
                 <w:rFonts w:asciiTheme="majorBidi" w:hAnsiTheme="majorBidi" w:cstheme="majorBidi"/>
                 <w:sz w:val="24"/>
@@ -13531,6 +14018,7 @@
           </w:tcPr>
           <w:p>
             <w:pPr>
+              <w:jc w:val="center"/>
               <w:rPr>
                 <w:rFonts w:asciiTheme="majorBidi" w:hAnsiTheme="majorBidi" w:cstheme="majorBidi"/>
                 <w:sz w:val="24"/>
@@ -13599,6 +14087,7 @@
           </w:tcPr>
           <w:p>
             <w:pPr>
+              <w:jc w:val="center"/>
               <w:rPr>
                 <w:rFonts w:asciiTheme="majorBidi" w:hAnsiTheme="majorBidi" w:cstheme="majorBidi"/>
                 <w:sz w:val="24"/>
@@ -13624,6 +14113,7 @@
           </w:tcPr>
           <w:p>
             <w:pPr>
+              <w:jc w:val="center"/>
               <w:rPr>
                 <w:rFonts w:asciiTheme="majorBidi" w:hAnsiTheme="majorBidi" w:cstheme="majorBidi"/>
                 <w:sz w:val="24"/>
@@ -13649,6 +14139,7 @@
           </w:tcPr>
           <w:p>
             <w:pPr>
+              <w:jc w:val="center"/>
               <w:rPr>
                 <w:rFonts w:asciiTheme="majorBidi" w:hAnsiTheme="majorBidi" w:cstheme="majorBidi"/>
                 <w:sz w:val="24"/>
@@ -13674,6 +14165,7 @@
           </w:tcPr>
           <w:p>
             <w:pPr>
+              <w:jc w:val="center"/>
               <w:rPr>
                 <w:rFonts w:asciiTheme="majorBidi" w:hAnsiTheme="majorBidi" w:cstheme="majorBidi"/>
                 <w:sz w:val="24"/>
@@ -13699,6 +14191,7 @@
           </w:tcPr>
           <w:p>
             <w:pPr>
+              <w:jc w:val="center"/>
               <w:rPr>
                 <w:rFonts w:asciiTheme="majorBidi" w:hAnsiTheme="majorBidi" w:cstheme="majorBidi"/>
                 <w:sz w:val="24"/>
@@ -13724,6 +14217,7 @@
           </w:tcPr>
           <w:p>
             <w:pPr>
+              <w:jc w:val="center"/>
               <w:rPr>
                 <w:rFonts w:asciiTheme="majorBidi" w:hAnsiTheme="majorBidi" w:cstheme="majorBidi"/>
                 <w:sz w:val="24"/>
@@ -13749,6 +14243,7 @@
           </w:tcPr>
           <w:p>
             <w:pPr>
+              <w:jc w:val="center"/>
               <w:rPr>
                 <w:rFonts w:asciiTheme="majorBidi" w:hAnsiTheme="majorBidi" w:cstheme="majorBidi"/>
                 <w:sz w:val="24"/>
@@ -13774,6 +14269,7 @@
           </w:tcPr>
           <w:p>
             <w:pPr>
+              <w:jc w:val="center"/>
               <w:rPr>
                 <w:rFonts w:asciiTheme="majorBidi" w:hAnsiTheme="majorBidi" w:cstheme="majorBidi"/>
                 <w:sz w:val="24"/>
@@ -13850,6 +14346,7 @@
           </w:tcPr>
           <w:p>
             <w:pPr>
+              <w:jc w:val="center"/>
               <w:rPr>
                 <w:rFonts w:asciiTheme="majorBidi" w:hAnsiTheme="majorBidi" w:cstheme="majorBidi"/>
                 <w:sz w:val="24"/>
@@ -13875,6 +14372,7 @@
           </w:tcPr>
           <w:p>
             <w:pPr>
+              <w:jc w:val="center"/>
               <w:rPr>
                 <w:rFonts w:asciiTheme="majorBidi" w:hAnsiTheme="majorBidi" w:cstheme="majorBidi"/>
                 <w:sz w:val="24"/>
@@ -13900,6 +14398,7 @@
           </w:tcPr>
           <w:p>
             <w:pPr>
+              <w:jc w:val="center"/>
               <w:rPr>
                 <w:rFonts w:asciiTheme="majorBidi" w:hAnsiTheme="majorBidi" w:cstheme="majorBidi"/>
                 <w:sz w:val="24"/>
@@ -13925,6 +14424,7 @@
           </w:tcPr>
           <w:p>
             <w:pPr>
+              <w:jc w:val="center"/>
               <w:rPr>
                 <w:rFonts w:asciiTheme="majorBidi" w:hAnsiTheme="majorBidi" w:cstheme="majorBidi"/>
                 <w:sz w:val="24"/>
@@ -13950,6 +14450,7 @@
           </w:tcPr>
           <w:p>
             <w:pPr>
+              <w:jc w:val="center"/>
               <w:rPr>
                 <w:rFonts w:asciiTheme="majorBidi" w:hAnsiTheme="majorBidi" w:cstheme="majorBidi"/>
                 <w:sz w:val="24"/>
@@ -13975,6 +14476,7 @@
           </w:tcPr>
           <w:p>
             <w:pPr>
+              <w:jc w:val="center"/>
               <w:rPr>
                 <w:rFonts w:asciiTheme="majorBidi" w:hAnsiTheme="majorBidi" w:cstheme="majorBidi"/>
                 <w:sz w:val="24"/>
@@ -14000,6 +14502,7 @@
           </w:tcPr>
           <w:p>
             <w:pPr>
+              <w:jc w:val="center"/>
               <w:rPr>
                 <w:rFonts w:asciiTheme="majorBidi" w:hAnsiTheme="majorBidi" w:cstheme="majorBidi"/>
                 <w:sz w:val="24"/>
@@ -14025,6 +14528,7 @@
           </w:tcPr>
           <w:p>
             <w:pPr>
+              <w:jc w:val="center"/>
               <w:rPr>
                 <w:rFonts w:asciiTheme="majorBidi" w:hAnsiTheme="majorBidi" w:cstheme="majorBidi"/>
                 <w:sz w:val="24"/>
@@ -14092,6 +14596,7 @@
           </w:tcPr>
           <w:p>
             <w:pPr>
+              <w:jc w:val="center"/>
               <w:rPr>
                 <w:rFonts w:asciiTheme="majorBidi" w:hAnsiTheme="majorBidi" w:cstheme="majorBidi"/>
                 <w:sz w:val="24"/>
@@ -14117,6 +14622,7 @@
           </w:tcPr>
           <w:p>
             <w:pPr>
+              <w:jc w:val="center"/>
               <w:rPr>
                 <w:rFonts w:asciiTheme="majorBidi" w:hAnsiTheme="majorBidi" w:cstheme="majorBidi"/>
                 <w:sz w:val="24"/>
@@ -14142,6 +14648,7 @@
           </w:tcPr>
           <w:p>
             <w:pPr>
+              <w:jc w:val="center"/>
               <w:rPr>
                 <w:rFonts w:asciiTheme="majorBidi" w:hAnsiTheme="majorBidi" w:cstheme="majorBidi"/>
                 <w:sz w:val="24"/>
@@ -14167,6 +14674,7 @@
           </w:tcPr>
           <w:p>
             <w:pPr>
+              <w:jc w:val="center"/>
               <w:rPr>
                 <w:rFonts w:asciiTheme="majorBidi" w:hAnsiTheme="majorBidi" w:cstheme="majorBidi"/>
                 <w:sz w:val="24"/>
@@ -14192,6 +14700,7 @@
           </w:tcPr>
           <w:p>
             <w:pPr>
+              <w:jc w:val="center"/>
               <w:rPr>
                 <w:rFonts w:asciiTheme="majorBidi" w:hAnsiTheme="majorBidi" w:cstheme="majorBidi"/>
                 <w:sz w:val="24"/>
@@ -14217,6 +14726,7 @@
           </w:tcPr>
           <w:p>
             <w:pPr>
+              <w:jc w:val="center"/>
               <w:rPr>
                 <w:rFonts w:asciiTheme="majorBidi" w:hAnsiTheme="majorBidi" w:cstheme="majorBidi"/>
                 <w:sz w:val="24"/>
@@ -14242,6 +14752,7 @@
           </w:tcPr>
           <w:p>
             <w:pPr>
+              <w:jc w:val="center"/>
               <w:rPr>
                 <w:rFonts w:asciiTheme="majorBidi" w:hAnsiTheme="majorBidi" w:cstheme="majorBidi"/>
                 <w:sz w:val="24"/>
@@ -14267,6 +14778,7 @@
           </w:tcPr>
           <w:p>
             <w:pPr>
+              <w:jc w:val="center"/>
               <w:rPr>
                 <w:rFonts w:asciiTheme="majorBidi" w:hAnsiTheme="majorBidi" w:cstheme="majorBidi"/>
                 <w:sz w:val="24"/>
@@ -14334,6 +14846,7 @@
           </w:tcPr>
           <w:p>
             <w:pPr>
+              <w:jc w:val="center"/>
               <w:rPr>
                 <w:rFonts w:asciiTheme="majorBidi" w:hAnsiTheme="majorBidi" w:cstheme="majorBidi"/>
                 <w:sz w:val="24"/>
@@ -14359,6 +14872,7 @@
           </w:tcPr>
           <w:p>
             <w:pPr>
+              <w:jc w:val="center"/>
               <w:rPr>
                 <w:rFonts w:asciiTheme="majorBidi" w:hAnsiTheme="majorBidi" w:cstheme="majorBidi"/>
                 <w:sz w:val="24"/>
@@ -14384,6 +14898,7 @@
           </w:tcPr>
           <w:p>
             <w:pPr>
+              <w:jc w:val="center"/>
               <w:rPr>
                 <w:rFonts w:asciiTheme="majorBidi" w:hAnsiTheme="majorBidi" w:cstheme="majorBidi"/>
                 <w:sz w:val="24"/>
@@ -14409,6 +14924,7 @@
           </w:tcPr>
           <w:p>
             <w:pPr>
+              <w:jc w:val="center"/>
               <w:rPr>
                 <w:rFonts w:asciiTheme="majorBidi" w:hAnsiTheme="majorBidi" w:cstheme="majorBidi"/>
                 <w:sz w:val="24"/>
@@ -14434,6 +14950,7 @@
           </w:tcPr>
           <w:p>
             <w:pPr>
+              <w:jc w:val="center"/>
               <w:rPr>
                 <w:rFonts w:asciiTheme="majorBidi" w:hAnsiTheme="majorBidi" w:cstheme="majorBidi"/>
                 <w:sz w:val="24"/>
@@ -14459,6 +14976,7 @@
           </w:tcPr>
           <w:p>
             <w:pPr>
+              <w:jc w:val="center"/>
               <w:rPr>
                 <w:rFonts w:asciiTheme="majorBidi" w:hAnsiTheme="majorBidi" w:cstheme="majorBidi"/>
                 <w:sz w:val="24"/>
@@ -14484,6 +15002,7 @@
           </w:tcPr>
           <w:p>
             <w:pPr>
+              <w:jc w:val="center"/>
               <w:rPr>
                 <w:rFonts w:asciiTheme="majorBidi" w:hAnsiTheme="majorBidi" w:cstheme="majorBidi"/>
                 <w:sz w:val="24"/>
@@ -14509,6 +15028,7 @@
           </w:tcPr>
           <w:p>
             <w:pPr>
+              <w:jc w:val="center"/>
               <w:rPr>
                 <w:rFonts w:asciiTheme="majorBidi" w:hAnsiTheme="majorBidi" w:cstheme="majorBidi"/>
                 <w:sz w:val="24"/>
@@ -14576,6 +15096,7 @@
           </w:tcPr>
           <w:p>
             <w:pPr>
+              <w:jc w:val="center"/>
               <w:rPr>
                 <w:rFonts w:asciiTheme="majorBidi" w:hAnsiTheme="majorBidi" w:cstheme="majorBidi"/>
                 <w:sz w:val="24"/>
@@ -14601,6 +15122,7 @@
           </w:tcPr>
           <w:p>
             <w:pPr>
+              <w:jc w:val="center"/>
               <w:rPr>
                 <w:rFonts w:asciiTheme="majorBidi" w:hAnsiTheme="majorBidi" w:cstheme="majorBidi"/>
                 <w:sz w:val="24"/>
@@ -14626,6 +15148,7 @@
           </w:tcPr>
           <w:p>
             <w:pPr>
+              <w:jc w:val="center"/>
               <w:rPr>
                 <w:rFonts w:asciiTheme="majorBidi" w:hAnsiTheme="majorBidi" w:cstheme="majorBidi"/>
                 <w:sz w:val="24"/>
@@ -14651,6 +15174,7 @@
           </w:tcPr>
           <w:p>
             <w:pPr>
+              <w:jc w:val="center"/>
               <w:rPr>
                 <w:rFonts w:asciiTheme="majorBidi" w:hAnsiTheme="majorBidi" w:cstheme="majorBidi"/>
                 <w:sz w:val="24"/>
@@ -14676,6 +15200,7 @@
           </w:tcPr>
           <w:p>
             <w:pPr>
+              <w:jc w:val="center"/>
               <w:rPr>
                 <w:rFonts w:asciiTheme="majorBidi" w:hAnsiTheme="majorBidi" w:cstheme="majorBidi"/>
                 <w:sz w:val="24"/>
@@ -14701,6 +15226,7 @@
           </w:tcPr>
           <w:p>
             <w:pPr>
+              <w:jc w:val="center"/>
               <w:rPr>
                 <w:rFonts w:asciiTheme="majorBidi" w:hAnsiTheme="majorBidi" w:cstheme="majorBidi"/>
                 <w:sz w:val="24"/>
@@ -14726,6 +15252,7 @@
           </w:tcPr>
           <w:p>
             <w:pPr>
+              <w:jc w:val="center"/>
               <w:rPr>
                 <w:rFonts w:asciiTheme="majorBidi" w:hAnsiTheme="majorBidi" w:cstheme="majorBidi"/>
                 <w:sz w:val="24"/>
@@ -14751,6 +15278,7 @@
           </w:tcPr>
           <w:p>
             <w:pPr>
+              <w:jc w:val="center"/>
               <w:rPr>
                 <w:rFonts w:asciiTheme="majorBidi" w:hAnsiTheme="majorBidi" w:cstheme="majorBidi"/>
                 <w:sz w:val="24"/>
@@ -14818,6 +15346,7 @@
           </w:tcPr>
           <w:p>
             <w:pPr>
+              <w:jc w:val="center"/>
               <w:rPr>
                 <w:rFonts w:asciiTheme="majorBidi" w:hAnsiTheme="majorBidi" w:cstheme="majorBidi"/>
                 <w:sz w:val="24"/>
@@ -14843,6 +15372,7 @@
           </w:tcPr>
           <w:p>
             <w:pPr>
+              <w:jc w:val="center"/>
               <w:rPr>
                 <w:rFonts w:asciiTheme="majorBidi" w:hAnsiTheme="majorBidi" w:cstheme="majorBidi"/>
                 <w:sz w:val="24"/>
@@ -14868,6 +15398,7 @@
           </w:tcPr>
           <w:p>
             <w:pPr>
+              <w:jc w:val="center"/>
               <w:rPr>
                 <w:rFonts w:asciiTheme="majorBidi" w:hAnsiTheme="majorBidi" w:cstheme="majorBidi"/>
                 <w:sz w:val="24"/>
@@ -14893,6 +15424,7 @@
           </w:tcPr>
           <w:p>
             <w:pPr>
+              <w:jc w:val="center"/>
               <w:rPr>
                 <w:rFonts w:asciiTheme="majorBidi" w:hAnsiTheme="majorBidi" w:cstheme="majorBidi"/>
                 <w:sz w:val="24"/>
@@ -14918,6 +15450,7 @@
           </w:tcPr>
           <w:p>
             <w:pPr>
+              <w:jc w:val="center"/>
               <w:rPr>
                 <w:rFonts w:asciiTheme="majorBidi" w:hAnsiTheme="majorBidi" w:cstheme="majorBidi"/>
                 <w:sz w:val="24"/>
@@ -14943,6 +15476,7 @@
           </w:tcPr>
           <w:p>
             <w:pPr>
+              <w:jc w:val="center"/>
               <w:rPr>
                 <w:rFonts w:asciiTheme="majorBidi" w:hAnsiTheme="majorBidi" w:cstheme="majorBidi"/>
                 <w:sz w:val="24"/>
@@ -14968,6 +15502,7 @@
           </w:tcPr>
           <w:p>
             <w:pPr>
+              <w:jc w:val="center"/>
               <w:rPr>
                 <w:rFonts w:asciiTheme="majorBidi" w:hAnsiTheme="majorBidi" w:cstheme="majorBidi"/>
                 <w:sz w:val="24"/>
@@ -14993,6 +15528,7 @@
           </w:tcPr>
           <w:p>
             <w:pPr>
+              <w:jc w:val="center"/>
               <w:rPr>
                 <w:rFonts w:asciiTheme="majorBidi" w:hAnsiTheme="majorBidi" w:cstheme="majorBidi"/>
                 <w:sz w:val="24"/>
@@ -15060,6 +15596,7 @@
           </w:tcPr>
           <w:p>
             <w:pPr>
+              <w:jc w:val="center"/>
               <w:rPr>
                 <w:rFonts w:asciiTheme="majorBidi" w:hAnsiTheme="majorBidi" w:cstheme="majorBidi"/>
                 <w:sz w:val="24"/>
@@ -15085,6 +15622,7 @@
           </w:tcPr>
           <w:p>
             <w:pPr>
+              <w:jc w:val="center"/>
               <w:rPr>
                 <w:rFonts w:asciiTheme="majorBidi" w:hAnsiTheme="majorBidi" w:cstheme="majorBidi"/>
                 <w:sz w:val="24"/>
@@ -15110,6 +15648,7 @@
           </w:tcPr>
           <w:p>
             <w:pPr>
+              <w:jc w:val="center"/>
               <w:rPr>
                 <w:rFonts w:asciiTheme="majorBidi" w:hAnsiTheme="majorBidi" w:cstheme="majorBidi"/>
                 <w:sz w:val="24"/>
@@ -15135,6 +15674,7 @@
           </w:tcPr>
           <w:p>
             <w:pPr>
+              <w:jc w:val="center"/>
               <w:rPr>
                 <w:rFonts w:asciiTheme="majorBidi" w:hAnsiTheme="majorBidi" w:cstheme="majorBidi"/>
                 <w:sz w:val="24"/>
@@ -15160,6 +15700,7 @@
           </w:tcPr>
           <w:p>
             <w:pPr>
+              <w:jc w:val="center"/>
               <w:rPr>
                 <w:rFonts w:asciiTheme="majorBidi" w:hAnsiTheme="majorBidi" w:cstheme="majorBidi"/>
                 <w:sz w:val="24"/>
@@ -15185,6 +15726,7 @@
           </w:tcPr>
           <w:p>
             <w:pPr>
+              <w:jc w:val="center"/>
               <w:rPr>
                 <w:rFonts w:asciiTheme="majorBidi" w:hAnsiTheme="majorBidi" w:cstheme="majorBidi"/>
                 <w:sz w:val="24"/>
@@ -15210,6 +15752,7 @@
           </w:tcPr>
           <w:p>
             <w:pPr>
+              <w:jc w:val="center"/>
               <w:rPr>
                 <w:rFonts w:asciiTheme="majorBidi" w:hAnsiTheme="majorBidi" w:cstheme="majorBidi"/>
                 <w:sz w:val="24"/>
@@ -15235,6 +15778,7 @@
           </w:tcPr>
           <w:p>
             <w:pPr>
+              <w:jc w:val="center"/>
               <w:rPr>
                 <w:rFonts w:asciiTheme="majorBidi" w:hAnsiTheme="majorBidi" w:cstheme="majorBidi"/>
                 <w:sz w:val="24"/>
@@ -15302,6 +15846,7 @@
           </w:tcPr>
           <w:p>
             <w:pPr>
+              <w:jc w:val="center"/>
               <w:rPr>
                 <w:rFonts w:asciiTheme="majorBidi" w:hAnsiTheme="majorBidi" w:cstheme="majorBidi"/>
                 <w:sz w:val="24"/>
@@ -15327,6 +15872,7 @@
           </w:tcPr>
           <w:p>
             <w:pPr>
+              <w:jc w:val="center"/>
               <w:rPr>
                 <w:rFonts w:asciiTheme="majorBidi" w:hAnsiTheme="majorBidi" w:cstheme="majorBidi"/>
                 <w:sz w:val="24"/>
@@ -15352,6 +15898,7 @@
           </w:tcPr>
           <w:p>
             <w:pPr>
+              <w:jc w:val="center"/>
               <w:rPr>
                 <w:rFonts w:asciiTheme="majorBidi" w:hAnsiTheme="majorBidi" w:cstheme="majorBidi"/>
                 <w:sz w:val="24"/>
@@ -15377,6 +15924,7 @@
           </w:tcPr>
           <w:p>
             <w:pPr>
+              <w:jc w:val="center"/>
               <w:rPr>
                 <w:rFonts w:asciiTheme="majorBidi" w:hAnsiTheme="majorBidi" w:cstheme="majorBidi"/>
                 <w:sz w:val="24"/>
@@ -15402,6 +15950,7 @@
           </w:tcPr>
           <w:p>
             <w:pPr>
+              <w:jc w:val="center"/>
               <w:rPr>
                 <w:rFonts w:asciiTheme="majorBidi" w:hAnsiTheme="majorBidi" w:cstheme="majorBidi"/>
                 <w:sz w:val="24"/>
@@ -15427,6 +15976,7 @@
           </w:tcPr>
           <w:p>
             <w:pPr>
+              <w:jc w:val="center"/>
               <w:rPr>
                 <w:rFonts w:asciiTheme="majorBidi" w:hAnsiTheme="majorBidi" w:cstheme="majorBidi"/>
                 <w:sz w:val="24"/>
@@ -15452,6 +16002,7 @@
           </w:tcPr>
           <w:p>
             <w:pPr>
+              <w:jc w:val="center"/>
               <w:rPr>
                 <w:rFonts w:asciiTheme="majorBidi" w:hAnsiTheme="majorBidi" w:cstheme="majorBidi"/>
                 <w:sz w:val="24"/>
@@ -15477,6 +16028,7 @@
           </w:tcPr>
           <w:p>
             <w:pPr>
+              <w:jc w:val="center"/>
               <w:rPr>
                 <w:rFonts w:asciiTheme="majorBidi" w:hAnsiTheme="majorBidi" w:cstheme="majorBidi"/>
                 <w:sz w:val="24"/>
@@ -15544,6 +16096,7 @@
           </w:tcPr>
           <w:p>
             <w:pPr>
+              <w:jc w:val="center"/>
               <w:rPr>
                 <w:rFonts w:asciiTheme="majorBidi" w:hAnsiTheme="majorBidi" w:cstheme="majorBidi"/>
                 <w:sz w:val="24"/>
@@ -15569,6 +16122,7 @@
           </w:tcPr>
           <w:p>
             <w:pPr>
+              <w:jc w:val="center"/>
               <w:rPr>
                 <w:rFonts w:asciiTheme="majorBidi" w:hAnsiTheme="majorBidi" w:cstheme="majorBidi"/>
                 <w:sz w:val="24"/>
@@ -15594,6 +16148,7 @@
           </w:tcPr>
           <w:p>
             <w:pPr>
+              <w:jc w:val="center"/>
               <w:rPr>
                 <w:rFonts w:asciiTheme="majorBidi" w:hAnsiTheme="majorBidi" w:cstheme="majorBidi"/>
                 <w:sz w:val="24"/>
@@ -15619,6 +16174,7 @@
           </w:tcPr>
           <w:p>
             <w:pPr>
+              <w:jc w:val="center"/>
               <w:rPr>
                 <w:rFonts w:asciiTheme="majorBidi" w:hAnsiTheme="majorBidi" w:cstheme="majorBidi"/>
                 <w:sz w:val="24"/>
@@ -15644,6 +16200,7 @@
           </w:tcPr>
           <w:p>
             <w:pPr>
+              <w:jc w:val="center"/>
               <w:rPr>
                 <w:rFonts w:asciiTheme="majorBidi" w:hAnsiTheme="majorBidi" w:cstheme="majorBidi"/>
                 <w:sz w:val="24"/>
@@ -15669,6 +16226,7 @@
           </w:tcPr>
           <w:p>
             <w:pPr>
+              <w:jc w:val="center"/>
               <w:rPr>
                 <w:rFonts w:asciiTheme="majorBidi" w:hAnsiTheme="majorBidi" w:cstheme="majorBidi"/>
                 <w:sz w:val="24"/>
@@ -15694,6 +16252,7 @@
           </w:tcPr>
           <w:p>
             <w:pPr>
+              <w:jc w:val="center"/>
               <w:rPr>
                 <w:rFonts w:asciiTheme="majorBidi" w:hAnsiTheme="majorBidi" w:cstheme="majorBidi"/>
                 <w:sz w:val="24"/>
@@ -15719,6 +16278,7 @@
           </w:tcPr>
           <w:p>
             <w:pPr>
+              <w:jc w:val="center"/>
               <w:rPr>
                 <w:rFonts w:asciiTheme="majorBidi" w:hAnsiTheme="majorBidi" w:cstheme="majorBidi"/>
                 <w:sz w:val="24"/>
@@ -15786,6 +16346,7 @@
           </w:tcPr>
           <w:p>
             <w:pPr>
+              <w:jc w:val="center"/>
               <w:rPr>
                 <w:rFonts w:asciiTheme="majorBidi" w:hAnsiTheme="majorBidi" w:cstheme="majorBidi"/>
                 <w:sz w:val="24"/>
@@ -15811,6 +16372,7 @@
           </w:tcPr>
           <w:p>
             <w:pPr>
+              <w:jc w:val="center"/>
               <w:rPr>
                 <w:rFonts w:asciiTheme="majorBidi" w:hAnsiTheme="majorBidi" w:cstheme="majorBidi"/>
                 <w:sz w:val="24"/>
@@ -15836,6 +16398,7 @@
           </w:tcPr>
           <w:p>
             <w:pPr>
+              <w:jc w:val="center"/>
               <w:rPr>
                 <w:rFonts w:asciiTheme="majorBidi" w:hAnsiTheme="majorBidi" w:cstheme="majorBidi"/>
                 <w:sz w:val="24"/>
@@ -15861,6 +16424,7 @@
           </w:tcPr>
           <w:p>
             <w:pPr>
+              <w:jc w:val="center"/>
               <w:rPr>
                 <w:rFonts w:asciiTheme="majorBidi" w:hAnsiTheme="majorBidi" w:cstheme="majorBidi"/>
                 <w:sz w:val="24"/>
@@ -15886,6 +16450,7 @@
           </w:tcPr>
           <w:p>
             <w:pPr>
+              <w:jc w:val="center"/>
               <w:rPr>
                 <w:rFonts w:asciiTheme="majorBidi" w:hAnsiTheme="majorBidi" w:cstheme="majorBidi"/>
                 <w:sz w:val="24"/>
@@ -15911,6 +16476,7 @@
           </w:tcPr>
           <w:p>
             <w:pPr>
+              <w:jc w:val="center"/>
               <w:rPr>
                 <w:rFonts w:asciiTheme="majorBidi" w:hAnsiTheme="majorBidi" w:cstheme="majorBidi"/>
                 <w:sz w:val="24"/>
@@ -15936,6 +16502,7 @@
           </w:tcPr>
           <w:p>
             <w:pPr>
+              <w:jc w:val="center"/>
               <w:rPr>
                 <w:rFonts w:asciiTheme="majorBidi" w:hAnsiTheme="majorBidi" w:cstheme="majorBidi"/>
                 <w:sz w:val="24"/>
@@ -15961,6 +16528,7 @@
           </w:tcPr>
           <w:p>
             <w:pPr>
+              <w:jc w:val="center"/>
               <w:rPr>
                 <w:rFonts w:asciiTheme="majorBidi" w:hAnsiTheme="majorBidi" w:cstheme="majorBidi"/>
                 <w:sz w:val="24"/>
@@ -16028,6 +16596,7 @@
           </w:tcPr>
           <w:p>
             <w:pPr>
+              <w:jc w:val="center"/>
               <w:rPr>
                 <w:rFonts w:asciiTheme="majorBidi" w:hAnsiTheme="majorBidi" w:cstheme="majorBidi"/>
                 <w:sz w:val="24"/>
@@ -16053,6 +16622,7 @@
           </w:tcPr>
           <w:p>
             <w:pPr>
+              <w:jc w:val="center"/>
               <w:rPr>
                 <w:rFonts w:asciiTheme="majorBidi" w:hAnsiTheme="majorBidi" w:cstheme="majorBidi"/>
                 <w:sz w:val="24"/>
@@ -16078,6 +16648,7 @@
           </w:tcPr>
           <w:p>
             <w:pPr>
+              <w:jc w:val="center"/>
               <w:rPr>
                 <w:rFonts w:asciiTheme="majorBidi" w:hAnsiTheme="majorBidi" w:cstheme="majorBidi"/>
                 <w:sz w:val="24"/>
@@ -16103,6 +16674,7 @@
           </w:tcPr>
           <w:p>
             <w:pPr>
+              <w:jc w:val="center"/>
               <w:rPr>
                 <w:rFonts w:asciiTheme="majorBidi" w:hAnsiTheme="majorBidi" w:cstheme="majorBidi"/>
                 <w:sz w:val="24"/>
@@ -16128,6 +16700,7 @@
           </w:tcPr>
           <w:p>
             <w:pPr>
+              <w:jc w:val="center"/>
               <w:rPr>
                 <w:rFonts w:asciiTheme="majorBidi" w:hAnsiTheme="majorBidi" w:cstheme="majorBidi"/>
                 <w:sz w:val="24"/>
@@ -16153,6 +16726,7 @@
           </w:tcPr>
           <w:p>
             <w:pPr>
+              <w:jc w:val="center"/>
               <w:rPr>
                 <w:rFonts w:asciiTheme="majorBidi" w:hAnsiTheme="majorBidi" w:cstheme="majorBidi"/>
                 <w:sz w:val="24"/>
@@ -16178,6 +16752,7 @@
           </w:tcPr>
           <w:p>
             <w:pPr>
+              <w:jc w:val="center"/>
               <w:rPr>
                 <w:rFonts w:asciiTheme="majorBidi" w:hAnsiTheme="majorBidi" w:cstheme="majorBidi"/>
                 <w:sz w:val="24"/>
@@ -16203,6 +16778,7 @@
           </w:tcPr>
           <w:p>
             <w:pPr>
+              <w:jc w:val="center"/>
               <w:rPr>
                 <w:rFonts w:asciiTheme="majorBidi" w:hAnsiTheme="majorBidi" w:cstheme="majorBidi"/>
                 <w:sz w:val="24"/>
@@ -16579,8 +17155,18 @@
                 <w:sz w:val="24"/>
                 <w:szCs w:val="24"/>
               </w:rPr>
-              <w:t>{{led_FSR_1_on}}ON</w:t>
-            </w:r>
+              <w:t>{{led_FSR_1_on</w:t>
+            </w:r>
+            <w:proofErr w:type="gramStart"/>
+            <w:r>
+              <w:rPr>
+                <w:rFonts w:asciiTheme="majorBidi" w:hAnsiTheme="majorBidi" w:cstheme="majorBidi"/>
+                <w:sz w:val="24"/>
+                <w:szCs w:val="24"/>
+              </w:rPr>
+              <w:t>}}ON</w:t>
+            </w:r>
+            <w:proofErr w:type="gramEnd"/>
           </w:p>
         </w:tc>
         <w:tc>
@@ -16604,8 +17190,18 @@
                 <w:sz w:val="24"/>
                 <w:szCs w:val="24"/>
               </w:rPr>
-              <w:t>{{led_FSR_1_off}}OFF</w:t>
-            </w:r>
+              <w:t>{{led_FSR_1_off</w:t>
+            </w:r>
+            <w:proofErr w:type="gramStart"/>
+            <w:r>
+              <w:rPr>
+                <w:rFonts w:asciiTheme="majorBidi" w:hAnsiTheme="majorBidi" w:cstheme="majorBidi"/>
+                <w:sz w:val="24"/>
+                <w:szCs w:val="24"/>
+              </w:rPr>
+              <w:t>}}OFF</w:t>
+            </w:r>
+            <w:proofErr w:type="gramEnd"/>
           </w:p>
         </w:tc>
         <w:tc>
@@ -16629,8 +17225,18 @@
                 <w:sz w:val="24"/>
                 <w:szCs w:val="24"/>
               </w:rPr>
-              <w:t>{{led_FSR_1_blink}}BLINK</w:t>
-            </w:r>
+              <w:t>{{led_FSR_1_blink</w:t>
+            </w:r>
+            <w:proofErr w:type="gramStart"/>
+            <w:r>
+              <w:rPr>
+                <w:rFonts w:asciiTheme="majorBidi" w:hAnsiTheme="majorBidi" w:cstheme="majorBidi"/>
+                <w:sz w:val="24"/>
+                <w:szCs w:val="24"/>
+              </w:rPr>
+              <w:t>}}BLINK</w:t>
+            </w:r>
+            <w:proofErr w:type="gramEnd"/>
           </w:p>
         </w:tc>
         <w:tc>
@@ -16745,8 +17351,18 @@
                 <w:sz w:val="24"/>
                 <w:szCs w:val="24"/>
               </w:rPr>
-              <w:t>{{led_DCR_1_on}}ON</w:t>
-            </w:r>
+              <w:t>{{led_DCR_1_on</w:t>
+            </w:r>
+            <w:proofErr w:type="gramStart"/>
+            <w:r>
+              <w:rPr>
+                <w:rFonts w:asciiTheme="majorBidi" w:hAnsiTheme="majorBidi" w:cstheme="majorBidi"/>
+                <w:sz w:val="24"/>
+                <w:szCs w:val="24"/>
+              </w:rPr>
+              <w:t>}}ON</w:t>
+            </w:r>
+            <w:proofErr w:type="gramEnd"/>
           </w:p>
         </w:tc>
         <w:tc>
@@ -16769,8 +17385,18 @@
                 <w:sz w:val="24"/>
                 <w:szCs w:val="24"/>
               </w:rPr>
-              <w:t>{{led_DCR_1_off}}OFF</w:t>
-            </w:r>
+              <w:t>{{led_DCR_1_off</w:t>
+            </w:r>
+            <w:proofErr w:type="gramStart"/>
+            <w:r>
+              <w:rPr>
+                <w:rFonts w:asciiTheme="majorBidi" w:hAnsiTheme="majorBidi" w:cstheme="majorBidi"/>
+                <w:sz w:val="24"/>
+                <w:szCs w:val="24"/>
+              </w:rPr>
+              <w:t>}}OFF</w:t>
+            </w:r>
+            <w:proofErr w:type="gramEnd"/>
           </w:p>
         </w:tc>
         <w:tc>
@@ -16909,8 +17535,18 @@
                 <w:sz w:val="24"/>
                 <w:szCs w:val="24"/>
               </w:rPr>
-              <w:t>{{led_NDR_1_on}}ON</w:t>
-            </w:r>
+              <w:t>{{led_NDR_1_on</w:t>
+            </w:r>
+            <w:proofErr w:type="gramStart"/>
+            <w:r>
+              <w:rPr>
+                <w:rFonts w:asciiTheme="majorBidi" w:hAnsiTheme="majorBidi" w:cstheme="majorBidi"/>
+                <w:sz w:val="24"/>
+                <w:szCs w:val="24"/>
+              </w:rPr>
+              <w:t>}}ON</w:t>
+            </w:r>
+            <w:proofErr w:type="gramEnd"/>
           </w:p>
         </w:tc>
         <w:tc>
@@ -16933,8 +17569,18 @@
                 <w:sz w:val="24"/>
                 <w:szCs w:val="24"/>
               </w:rPr>
-              <w:t>{{led_NDR_1_off}}OFF</w:t>
-            </w:r>
+              <w:t>{{led_NDR_1_off</w:t>
+            </w:r>
+            <w:proofErr w:type="gramStart"/>
+            <w:r>
+              <w:rPr>
+                <w:rFonts w:asciiTheme="majorBidi" w:hAnsiTheme="majorBidi" w:cstheme="majorBidi"/>
+                <w:sz w:val="24"/>
+                <w:szCs w:val="24"/>
+              </w:rPr>
+              <w:t>}}OFF</w:t>
+            </w:r>
+            <w:proofErr w:type="gramEnd"/>
           </w:p>
         </w:tc>
         <w:tc>
@@ -16957,8 +17603,18 @@
                 <w:sz w:val="24"/>
                 <w:szCs w:val="24"/>
               </w:rPr>
-              <w:t>{{led_NDR_1_blink}}BLINK</w:t>
-            </w:r>
+              <w:t>{{led_NDR_1_blink</w:t>
+            </w:r>
+            <w:proofErr w:type="gramStart"/>
+            <w:r>
+              <w:rPr>
+                <w:rFonts w:asciiTheme="majorBidi" w:hAnsiTheme="majorBidi" w:cstheme="majorBidi"/>
+                <w:sz w:val="24"/>
+                <w:szCs w:val="24"/>
+              </w:rPr>
+              <w:t>}}BLINK</w:t>
+            </w:r>
+            <w:proofErr w:type="gramEnd"/>
           </w:p>
         </w:tc>
         <w:tc>
@@ -17073,8 +17729,18 @@
                 <w:sz w:val="24"/>
                 <w:szCs w:val="24"/>
               </w:rPr>
-              <w:t>{{led_FIR_2_on}}ON</w:t>
-            </w:r>
+              <w:t>{{led_FIR_2_on</w:t>
+            </w:r>
+            <w:proofErr w:type="gramStart"/>
+            <w:r>
+              <w:rPr>
+                <w:rFonts w:asciiTheme="majorBidi" w:hAnsiTheme="majorBidi" w:cstheme="majorBidi"/>
+                <w:sz w:val="24"/>
+                <w:szCs w:val="24"/>
+              </w:rPr>
+              <w:t>}}ON</w:t>
+            </w:r>
+            <w:proofErr w:type="gramEnd"/>
           </w:p>
         </w:tc>
         <w:tc>
@@ -17138,13 +17804,23 @@
                 <w:szCs w:val="24"/>
               </w:rPr>
             </w:pPr>
-            <w:r>
-              <w:rPr>
-                <w:rFonts w:asciiTheme="majorBidi" w:hAnsiTheme="majorBidi" w:cstheme="majorBidi"/>
-                <w:sz w:val="24"/>
-                <w:szCs w:val="24"/>
-              </w:rPr>
-              <w:t>{{remark_FIR_2}}</w:t>
+            <w:proofErr w:type="gramStart"/>
+            <w:r>
+              <w:rPr>
+                <w:rFonts w:asciiTheme="majorBidi" w:hAnsiTheme="majorBidi" w:cstheme="majorBidi"/>
+                <w:sz w:val="24"/>
+                <w:szCs w:val="24"/>
+              </w:rPr>
+              <w:t>{{remark_</w:t>
+            </w:r>
+            <w:proofErr w:type="gramEnd"/>
+            <w:r>
+              <w:rPr>
+                <w:rFonts w:asciiTheme="majorBidi" w:hAnsiTheme="majorBidi" w:cstheme="majorBidi"/>
+                <w:sz w:val="24"/>
+                <w:szCs w:val="24"/>
+              </w:rPr>
+              <w:t>FIR_2}}</w:t>
             </w:r>
           </w:p>
         </w:tc>
@@ -17237,8 +17913,18 @@
                 <w:sz w:val="24"/>
                 <w:szCs w:val="24"/>
               </w:rPr>
-              <w:t>{{led_DOR_2_on}}ON</w:t>
-            </w:r>
+              <w:t>{{led_DOR_2_on</w:t>
+            </w:r>
+            <w:proofErr w:type="gramStart"/>
+            <w:r>
+              <w:rPr>
+                <w:rFonts w:asciiTheme="majorBidi" w:hAnsiTheme="majorBidi" w:cstheme="majorBidi"/>
+                <w:sz w:val="24"/>
+                <w:szCs w:val="24"/>
+              </w:rPr>
+              <w:t>}}ON</w:t>
+            </w:r>
+            <w:proofErr w:type="gramEnd"/>
           </w:p>
         </w:tc>
         <w:tc>
@@ -17261,8 +17947,18 @@
                 <w:sz w:val="24"/>
                 <w:szCs w:val="24"/>
               </w:rPr>
-              <w:t>{{led_DOR_2_off}}OFF</w:t>
-            </w:r>
+              <w:t>{{led_DOR_2_off</w:t>
+            </w:r>
+            <w:proofErr w:type="gramStart"/>
+            <w:r>
+              <w:rPr>
+                <w:rFonts w:asciiTheme="majorBidi" w:hAnsiTheme="majorBidi" w:cstheme="majorBidi"/>
+                <w:sz w:val="24"/>
+                <w:szCs w:val="24"/>
+              </w:rPr>
+              <w:t>}}OFF</w:t>
+            </w:r>
+            <w:proofErr w:type="gramEnd"/>
           </w:p>
         </w:tc>
         <w:tc>
@@ -17285,8 +17981,18 @@
                 <w:sz w:val="24"/>
                 <w:szCs w:val="24"/>
               </w:rPr>
-              <w:t>{{led_DOR_2_blink}}BLINK</w:t>
-            </w:r>
+              <w:t>{{led_DOR_2_blink</w:t>
+            </w:r>
+            <w:proofErr w:type="gramStart"/>
+            <w:r>
+              <w:rPr>
+                <w:rFonts w:asciiTheme="majorBidi" w:hAnsiTheme="majorBidi" w:cstheme="majorBidi"/>
+                <w:sz w:val="24"/>
+                <w:szCs w:val="24"/>
+              </w:rPr>
+              <w:t>}}BLINK</w:t>
+            </w:r>
+            <w:proofErr w:type="gramEnd"/>
           </w:p>
         </w:tc>
         <w:tc>
@@ -17401,8 +18107,18 @@
                 <w:sz w:val="24"/>
                 <w:szCs w:val="24"/>
               </w:rPr>
-              <w:t>{{led_RDR_2_on}}ON</w:t>
-            </w:r>
+              <w:t>{{led_RDR_2_on</w:t>
+            </w:r>
+            <w:proofErr w:type="gramStart"/>
+            <w:r>
+              <w:rPr>
+                <w:rFonts w:asciiTheme="majorBidi" w:hAnsiTheme="majorBidi" w:cstheme="majorBidi"/>
+                <w:sz w:val="24"/>
+                <w:szCs w:val="24"/>
+              </w:rPr>
+              <w:t>}}ON</w:t>
+            </w:r>
+            <w:proofErr w:type="gramEnd"/>
           </w:p>
         </w:tc>
         <w:tc>
@@ -17425,8 +18141,18 @@
                 <w:sz w:val="24"/>
                 <w:szCs w:val="24"/>
               </w:rPr>
-              <w:t>{{led_RDR_2_off}}OFF</w:t>
-            </w:r>
+              <w:t>{{led_RDR_2_off</w:t>
+            </w:r>
+            <w:proofErr w:type="gramStart"/>
+            <w:r>
+              <w:rPr>
+                <w:rFonts w:asciiTheme="majorBidi" w:hAnsiTheme="majorBidi" w:cstheme="majorBidi"/>
+                <w:sz w:val="24"/>
+                <w:szCs w:val="24"/>
+              </w:rPr>
+              <w:t>}}OFF</w:t>
+            </w:r>
+            <w:proofErr w:type="gramEnd"/>
           </w:p>
         </w:tc>
         <w:tc>
@@ -17449,8 +18175,18 @@
                 <w:sz w:val="24"/>
                 <w:szCs w:val="24"/>
               </w:rPr>
-              <w:t>{{led_RDR_2_blink}}BLINK</w:t>
-            </w:r>
+              <w:t>{{led_RDR_2_blink</w:t>
+            </w:r>
+            <w:proofErr w:type="gramStart"/>
+            <w:r>
+              <w:rPr>
+                <w:rFonts w:asciiTheme="majorBidi" w:hAnsiTheme="majorBidi" w:cstheme="majorBidi"/>
+                <w:sz w:val="24"/>
+                <w:szCs w:val="24"/>
+              </w:rPr>
+              <w:t>}}BLINK</w:t>
+            </w:r>
+            <w:proofErr w:type="gramEnd"/>
           </w:p>
         </w:tc>
         <w:tc>
@@ -17466,13 +18202,23 @@
                 <w:szCs w:val="24"/>
               </w:rPr>
             </w:pPr>
-            <w:r>
-              <w:rPr>
-                <w:rFonts w:asciiTheme="majorBidi" w:hAnsiTheme="majorBidi" w:cstheme="majorBidi"/>
-                <w:sz w:val="24"/>
-                <w:szCs w:val="24"/>
-              </w:rPr>
-              <w:t>{{remark_RDR_2}}</w:t>
+            <w:proofErr w:type="gramStart"/>
+            <w:r>
+              <w:rPr>
+                <w:rFonts w:asciiTheme="majorBidi" w:hAnsiTheme="majorBidi" w:cstheme="majorBidi"/>
+                <w:sz w:val="24"/>
+                <w:szCs w:val="24"/>
+              </w:rPr>
+              <w:t>{{remark_</w:t>
+            </w:r>
+            <w:proofErr w:type="gramEnd"/>
+            <w:r>
+              <w:rPr>
+                <w:rFonts w:asciiTheme="majorBidi" w:hAnsiTheme="majorBidi" w:cstheme="majorBidi"/>
+                <w:sz w:val="24"/>
+                <w:szCs w:val="24"/>
+              </w:rPr>
+              <w:t>RDR_2}}</w:t>
             </w:r>
           </w:p>
         </w:tc>
@@ -17565,8 +18311,18 @@
                 <w:sz w:val="24"/>
                 <w:szCs w:val="24"/>
               </w:rPr>
-              <w:t>{{led_ADCLR_2_on}}ON</w:t>
-            </w:r>
+              <w:t>{{led_ADCLR_2_on</w:t>
+            </w:r>
+            <w:proofErr w:type="gramStart"/>
+            <w:r>
+              <w:rPr>
+                <w:rFonts w:asciiTheme="majorBidi" w:hAnsiTheme="majorBidi" w:cstheme="majorBidi"/>
+                <w:sz w:val="24"/>
+                <w:szCs w:val="24"/>
+              </w:rPr>
+              <w:t>}}ON</w:t>
+            </w:r>
+            <w:proofErr w:type="gramEnd"/>
           </w:p>
         </w:tc>
         <w:tc>
@@ -17589,8 +18345,18 @@
                 <w:sz w:val="24"/>
                 <w:szCs w:val="24"/>
               </w:rPr>
-              <w:t>{{led_ADCLR_2_off}}OFF</w:t>
-            </w:r>
+              <w:t>{{led_ADCLR_2_off</w:t>
+            </w:r>
+            <w:proofErr w:type="gramStart"/>
+            <w:r>
+              <w:rPr>
+                <w:rFonts w:asciiTheme="majorBidi" w:hAnsiTheme="majorBidi" w:cstheme="majorBidi"/>
+                <w:sz w:val="24"/>
+                <w:szCs w:val="24"/>
+              </w:rPr>
+              <w:t>}}OFF</w:t>
+            </w:r>
+            <w:proofErr w:type="gramEnd"/>
           </w:p>
         </w:tc>
         <w:tc>
@@ -17613,8 +18379,18 @@
                 <w:sz w:val="24"/>
                 <w:szCs w:val="24"/>
               </w:rPr>
-              <w:t>{{led_ADCLR_2_blink}}BLINK</w:t>
-            </w:r>
+              <w:t>{{led_ADCLR_2_blink</w:t>
+            </w:r>
+            <w:proofErr w:type="gramStart"/>
+            <w:r>
+              <w:rPr>
+                <w:rFonts w:asciiTheme="majorBidi" w:hAnsiTheme="majorBidi" w:cstheme="majorBidi"/>
+                <w:sz w:val="24"/>
+                <w:szCs w:val="24"/>
+              </w:rPr>
+              <w:t>}}BLINK</w:t>
+            </w:r>
+            <w:proofErr w:type="gramEnd"/>
           </w:p>
         </w:tc>
         <w:tc>
@@ -17630,13 +18406,23 @@
                 <w:szCs w:val="24"/>
               </w:rPr>
             </w:pPr>
-            <w:r>
-              <w:rPr>
-                <w:rFonts w:asciiTheme="majorBidi" w:hAnsiTheme="majorBidi" w:cstheme="majorBidi"/>
-                <w:sz w:val="24"/>
-                <w:szCs w:val="24"/>
-              </w:rPr>
-              <w:t>{{remark_ADCLR_2}}</w:t>
+            <w:proofErr w:type="gramStart"/>
+            <w:r>
+              <w:rPr>
+                <w:rFonts w:asciiTheme="majorBidi" w:hAnsiTheme="majorBidi" w:cstheme="majorBidi"/>
+                <w:sz w:val="24"/>
+                <w:szCs w:val="24"/>
+              </w:rPr>
+              <w:t>{{remark_</w:t>
+            </w:r>
+            <w:proofErr w:type="gramEnd"/>
+            <w:r>
+              <w:rPr>
+                <w:rFonts w:asciiTheme="majorBidi" w:hAnsiTheme="majorBidi" w:cstheme="majorBidi"/>
+                <w:sz w:val="24"/>
+                <w:szCs w:val="24"/>
+              </w:rPr>
+              <w:t>ADCLR_2}}</w:t>
             </w:r>
           </w:p>
         </w:tc>
@@ -17729,8 +18515,18 @@
                 <w:sz w:val="24"/>
                 <w:szCs w:val="24"/>
               </w:rPr>
-              <w:t>{{led_3CTR_1_on}}ON</w:t>
-            </w:r>
+              <w:t>{{led_3CTR_1_on</w:t>
+            </w:r>
+            <w:proofErr w:type="gramStart"/>
+            <w:r>
+              <w:rPr>
+                <w:rFonts w:asciiTheme="majorBidi" w:hAnsiTheme="majorBidi" w:cstheme="majorBidi"/>
+                <w:sz w:val="24"/>
+                <w:szCs w:val="24"/>
+              </w:rPr>
+              <w:t>}}ON</w:t>
+            </w:r>
+            <w:proofErr w:type="gramEnd"/>
           </w:p>
         </w:tc>
         <w:tc>
@@ -17753,8 +18549,18 @@
                 <w:sz w:val="24"/>
                 <w:szCs w:val="24"/>
               </w:rPr>
-              <w:t>{{led_3CTR_1_off}}OFF</w:t>
-            </w:r>
+              <w:t>{{led_3CTR_1_off</w:t>
+            </w:r>
+            <w:proofErr w:type="gramStart"/>
+            <w:r>
+              <w:rPr>
+                <w:rFonts w:asciiTheme="majorBidi" w:hAnsiTheme="majorBidi" w:cstheme="majorBidi"/>
+                <w:sz w:val="24"/>
+                <w:szCs w:val="24"/>
+              </w:rPr>
+              <w:t>}}OFF</w:t>
+            </w:r>
+            <w:proofErr w:type="gramEnd"/>
           </w:p>
         </w:tc>
         <w:tc>
@@ -17777,8 +18583,18 @@
                 <w:sz w:val="24"/>
                 <w:szCs w:val="24"/>
               </w:rPr>
-              <w:t>{{led_3CTR_1_blink}}BLINK</w:t>
-            </w:r>
+              <w:t>{{led_3CTR_1_blink</w:t>
+            </w:r>
+            <w:proofErr w:type="gramStart"/>
+            <w:r>
+              <w:rPr>
+                <w:rFonts w:asciiTheme="majorBidi" w:hAnsiTheme="majorBidi" w:cstheme="majorBidi"/>
+                <w:sz w:val="24"/>
+                <w:szCs w:val="24"/>
+              </w:rPr>
+              <w:t>}}BLINK</w:t>
+            </w:r>
+            <w:proofErr w:type="gramEnd"/>
           </w:p>
         </w:tc>
         <w:tc>
@@ -17895,8 +18711,18 @@
                 <w:sz w:val="24"/>
                 <w:szCs w:val="24"/>
               </w:rPr>
-              <w:t>{{led_4CTR_1_on}}ON</w:t>
-            </w:r>
+              <w:t>{{led_4CTR_1_on</w:t>
+            </w:r>
+            <w:proofErr w:type="gramStart"/>
+            <w:r>
+              <w:rPr>
+                <w:rFonts w:asciiTheme="majorBidi" w:hAnsiTheme="majorBidi" w:cstheme="majorBidi"/>
+                <w:sz w:val="24"/>
+                <w:szCs w:val="24"/>
+              </w:rPr>
+              <w:t>}}ON</w:t>
+            </w:r>
+            <w:proofErr w:type="gramEnd"/>
           </w:p>
         </w:tc>
         <w:tc>
@@ -17920,8 +18746,18 @@
                 <w:sz w:val="24"/>
                 <w:szCs w:val="24"/>
               </w:rPr>
-              <w:t>{{led_4CTR_1_off}}OFF</w:t>
-            </w:r>
+              <w:t>{{led_4CTR_1_off</w:t>
+            </w:r>
+            <w:proofErr w:type="gramStart"/>
+            <w:r>
+              <w:rPr>
+                <w:rFonts w:asciiTheme="majorBidi" w:hAnsiTheme="majorBidi" w:cstheme="majorBidi"/>
+                <w:sz w:val="24"/>
+                <w:szCs w:val="24"/>
+              </w:rPr>
+              <w:t>}}OFF</w:t>
+            </w:r>
+            <w:proofErr w:type="gramEnd"/>
           </w:p>
         </w:tc>
         <w:tc>
@@ -17944,8 +18780,18 @@
                 <w:sz w:val="24"/>
                 <w:szCs w:val="24"/>
               </w:rPr>
-              <w:t>{{led_4CTR_1_blink}}BLINK</w:t>
-            </w:r>
+              <w:t>{{led_4CTR_1_blink</w:t>
+            </w:r>
+            <w:proofErr w:type="gramStart"/>
+            <w:r>
+              <w:rPr>
+                <w:rFonts w:asciiTheme="majorBidi" w:hAnsiTheme="majorBidi" w:cstheme="majorBidi"/>
+                <w:sz w:val="24"/>
+                <w:szCs w:val="24"/>
+              </w:rPr>
+              <w:t>}}BLINK</w:t>
+            </w:r>
+            <w:proofErr w:type="gramEnd"/>
           </w:p>
         </w:tc>
         <w:tc>
@@ -17961,13 +18807,23 @@
                 <w:szCs w:val="24"/>
               </w:rPr>
             </w:pPr>
-            <w:r>
-              <w:rPr>
-                <w:rFonts w:asciiTheme="majorBidi" w:hAnsiTheme="majorBidi" w:cstheme="majorBidi"/>
-                <w:sz w:val="24"/>
-                <w:szCs w:val="24"/>
-              </w:rPr>
-              <w:t>{{remark_4CTR_1}}</w:t>
+            <w:proofErr w:type="gramStart"/>
+            <w:r>
+              <w:rPr>
+                <w:rFonts w:asciiTheme="majorBidi" w:hAnsiTheme="majorBidi" w:cstheme="majorBidi"/>
+                <w:sz w:val="24"/>
+                <w:szCs w:val="24"/>
+              </w:rPr>
+              <w:t>{{remark_4CTR</w:t>
+            </w:r>
+            <w:proofErr w:type="gramEnd"/>
+            <w:r>
+              <w:rPr>
+                <w:rFonts w:asciiTheme="majorBidi" w:hAnsiTheme="majorBidi" w:cstheme="majorBidi"/>
+                <w:sz w:val="24"/>
+                <w:szCs w:val="24"/>
+              </w:rPr>
+              <w:t>_1}}</w:t>
             </w:r>
           </w:p>
         </w:tc>
@@ -18062,8 +18918,18 @@
                 <w:sz w:val="24"/>
                 <w:szCs w:val="24"/>
               </w:rPr>
-              <w:t>{{led_6CTR_1_on}}ON</w:t>
-            </w:r>
+              <w:t>{{led_6CTR_1_on</w:t>
+            </w:r>
+            <w:proofErr w:type="gramStart"/>
+            <w:r>
+              <w:rPr>
+                <w:rFonts w:asciiTheme="majorBidi" w:hAnsiTheme="majorBidi" w:cstheme="majorBidi"/>
+                <w:sz w:val="24"/>
+                <w:szCs w:val="24"/>
+              </w:rPr>
+              <w:t>}}ON</w:t>
+            </w:r>
+            <w:proofErr w:type="gramEnd"/>
           </w:p>
         </w:tc>
         <w:tc>
@@ -18087,8 +18953,18 @@
                 <w:sz w:val="24"/>
                 <w:szCs w:val="24"/>
               </w:rPr>
-              <w:t>{{led_6CTR_1_off}}OFF</w:t>
-            </w:r>
+              <w:t>{{led_6CTR_1_off</w:t>
+            </w:r>
+            <w:proofErr w:type="gramStart"/>
+            <w:r>
+              <w:rPr>
+                <w:rFonts w:asciiTheme="majorBidi" w:hAnsiTheme="majorBidi" w:cstheme="majorBidi"/>
+                <w:sz w:val="24"/>
+                <w:szCs w:val="24"/>
+              </w:rPr>
+              <w:t>}}OFF</w:t>
+            </w:r>
+            <w:proofErr w:type="gramEnd"/>
           </w:p>
         </w:tc>
         <w:tc>
@@ -18111,8 +18987,18 @@
                 <w:sz w:val="24"/>
                 <w:szCs w:val="24"/>
               </w:rPr>
-              <w:t>{{led_6CTR_1_blink}}BLINK</w:t>
-            </w:r>
+              <w:t>{{led_6CTR_1_blink</w:t>
+            </w:r>
+            <w:proofErr w:type="gramStart"/>
+            <w:r>
+              <w:rPr>
+                <w:rFonts w:asciiTheme="majorBidi" w:hAnsiTheme="majorBidi" w:cstheme="majorBidi"/>
+                <w:sz w:val="24"/>
+                <w:szCs w:val="24"/>
+              </w:rPr>
+              <w:t>}}BLINK</w:t>
+            </w:r>
+            <w:proofErr w:type="gramEnd"/>
           </w:p>
         </w:tc>
         <w:tc>
@@ -18128,13 +19014,23 @@
                 <w:szCs w:val="24"/>
               </w:rPr>
             </w:pPr>
-            <w:r>
-              <w:rPr>
-                <w:rFonts w:asciiTheme="majorBidi" w:hAnsiTheme="majorBidi" w:cstheme="majorBidi"/>
-                <w:sz w:val="24"/>
-                <w:szCs w:val="24"/>
-              </w:rPr>
-              <w:t>{{remark_6CTR_1}}</w:t>
+            <w:proofErr w:type="gramStart"/>
+            <w:r>
+              <w:rPr>
+                <w:rFonts w:asciiTheme="majorBidi" w:hAnsiTheme="majorBidi" w:cstheme="majorBidi"/>
+                <w:sz w:val="24"/>
+                <w:szCs w:val="24"/>
+              </w:rPr>
+              <w:t>{{remark_6CTR</w:t>
+            </w:r>
+            <w:proofErr w:type="gramEnd"/>
+            <w:r>
+              <w:rPr>
+                <w:rFonts w:asciiTheme="majorBidi" w:hAnsiTheme="majorBidi" w:cstheme="majorBidi"/>
+                <w:sz w:val="24"/>
+                <w:szCs w:val="24"/>
+              </w:rPr>
+              <w:t>_1}}</w:t>
             </w:r>
           </w:p>
         </w:tc>
@@ -18237,8 +19133,18 @@
                 <w:sz w:val="24"/>
                 <w:szCs w:val="24"/>
               </w:rPr>
-              <w:t>{{led_FSR_3_on}}ON</w:t>
-            </w:r>
+              <w:t>{{led_FSR_3_on</w:t>
+            </w:r>
+            <w:proofErr w:type="gramStart"/>
+            <w:r>
+              <w:rPr>
+                <w:rFonts w:asciiTheme="majorBidi" w:hAnsiTheme="majorBidi" w:cstheme="majorBidi"/>
+                <w:sz w:val="24"/>
+                <w:szCs w:val="24"/>
+              </w:rPr>
+              <w:t>}}ON</w:t>
+            </w:r>
+            <w:proofErr w:type="gramEnd"/>
           </w:p>
         </w:tc>
         <w:tc>
@@ -18262,8 +19168,18 @@
                 <w:sz w:val="24"/>
                 <w:szCs w:val="24"/>
               </w:rPr>
-              <w:t>{{led_FSR_3_off}}OFF</w:t>
-            </w:r>
+              <w:t>{{led_FSR_3_off</w:t>
+            </w:r>
+            <w:proofErr w:type="gramStart"/>
+            <w:r>
+              <w:rPr>
+                <w:rFonts w:asciiTheme="majorBidi" w:hAnsiTheme="majorBidi" w:cstheme="majorBidi"/>
+                <w:sz w:val="24"/>
+                <w:szCs w:val="24"/>
+              </w:rPr>
+              <w:t>}}OFF</w:t>
+            </w:r>
+            <w:proofErr w:type="gramEnd"/>
           </w:p>
         </w:tc>
         <w:tc>
@@ -18286,8 +19202,18 @@
                 <w:sz w:val="24"/>
                 <w:szCs w:val="24"/>
               </w:rPr>
-              <w:t>{{led_FSR_3_blink}}BLINK</w:t>
-            </w:r>
+              <w:t>{{led_FSR_3_blink</w:t>
+            </w:r>
+            <w:proofErr w:type="gramStart"/>
+            <w:r>
+              <w:rPr>
+                <w:rFonts w:asciiTheme="majorBidi" w:hAnsiTheme="majorBidi" w:cstheme="majorBidi"/>
+                <w:sz w:val="24"/>
+                <w:szCs w:val="24"/>
+              </w:rPr>
+              <w:t>}}BLINK</w:t>
+            </w:r>
+            <w:proofErr w:type="gramEnd"/>
           </w:p>
         </w:tc>
         <w:tc>
@@ -18303,13 +19229,23 @@
                 <w:szCs w:val="24"/>
               </w:rPr>
             </w:pPr>
-            <w:r>
-              <w:rPr>
-                <w:rFonts w:asciiTheme="majorBidi" w:hAnsiTheme="majorBidi" w:cstheme="majorBidi"/>
-                <w:sz w:val="24"/>
-                <w:szCs w:val="24"/>
-              </w:rPr>
-              <w:t>{{remark_FSR_3}}</w:t>
+            <w:proofErr w:type="gramStart"/>
+            <w:r>
+              <w:rPr>
+                <w:rFonts w:asciiTheme="majorBidi" w:hAnsiTheme="majorBidi" w:cstheme="majorBidi"/>
+                <w:sz w:val="24"/>
+                <w:szCs w:val="24"/>
+              </w:rPr>
+              <w:t>{{remark_</w:t>
+            </w:r>
+            <w:proofErr w:type="gramEnd"/>
+            <w:r>
+              <w:rPr>
+                <w:rFonts w:asciiTheme="majorBidi" w:hAnsiTheme="majorBidi" w:cstheme="majorBidi"/>
+                <w:sz w:val="24"/>
+                <w:szCs w:val="24"/>
+              </w:rPr>
+              <w:t>FSR_3}}</w:t>
             </w:r>
           </w:p>
         </w:tc>
@@ -18403,8 +19339,18 @@
                 <w:sz w:val="24"/>
                 <w:szCs w:val="24"/>
               </w:rPr>
-              <w:t>{{led_DCR_3_on}}ON</w:t>
-            </w:r>
+              <w:t>{{led_DCR_3_on</w:t>
+            </w:r>
+            <w:proofErr w:type="gramStart"/>
+            <w:r>
+              <w:rPr>
+                <w:rFonts w:asciiTheme="majorBidi" w:hAnsiTheme="majorBidi" w:cstheme="majorBidi"/>
+                <w:sz w:val="24"/>
+                <w:szCs w:val="24"/>
+              </w:rPr>
+              <w:t>}}ON</w:t>
+            </w:r>
+            <w:proofErr w:type="gramEnd"/>
           </w:p>
         </w:tc>
         <w:tc>
@@ -18428,8 +19374,18 @@
                 <w:sz w:val="24"/>
                 <w:szCs w:val="24"/>
               </w:rPr>
-              <w:t>{{led_DCR_3_off}}OFF</w:t>
-            </w:r>
+              <w:t>{{led_DCR_3_off</w:t>
+            </w:r>
+            <w:proofErr w:type="gramStart"/>
+            <w:r>
+              <w:rPr>
+                <w:rFonts w:asciiTheme="majorBidi" w:hAnsiTheme="majorBidi" w:cstheme="majorBidi"/>
+                <w:sz w:val="24"/>
+                <w:szCs w:val="24"/>
+              </w:rPr>
+              <w:t>}}OFF</w:t>
+            </w:r>
+            <w:proofErr w:type="gramEnd"/>
           </w:p>
         </w:tc>
         <w:tc>
@@ -18452,8 +19408,18 @@
                 <w:sz w:val="24"/>
                 <w:szCs w:val="24"/>
               </w:rPr>
-              <w:t>{{led_DCR_3_blink}}BLINK</w:t>
-            </w:r>
+              <w:t>{{led_DCR_3_blink</w:t>
+            </w:r>
+            <w:proofErr w:type="gramStart"/>
+            <w:r>
+              <w:rPr>
+                <w:rFonts w:asciiTheme="majorBidi" w:hAnsiTheme="majorBidi" w:cstheme="majorBidi"/>
+                <w:sz w:val="24"/>
+                <w:szCs w:val="24"/>
+              </w:rPr>
+              <w:t>}}BLINK</w:t>
+            </w:r>
+            <w:proofErr w:type="gramEnd"/>
           </w:p>
         </w:tc>
         <w:tc>
@@ -18569,8 +19535,18 @@
                 <w:sz w:val="24"/>
                 <w:szCs w:val="24"/>
               </w:rPr>
-              <w:t>{{led_NDR_3_on}}ON</w:t>
-            </w:r>
+              <w:t>{{led_NDR_3_on</w:t>
+            </w:r>
+            <w:proofErr w:type="gramStart"/>
+            <w:r>
+              <w:rPr>
+                <w:rFonts w:asciiTheme="majorBidi" w:hAnsiTheme="majorBidi" w:cstheme="majorBidi"/>
+                <w:sz w:val="24"/>
+                <w:szCs w:val="24"/>
+              </w:rPr>
+              <w:t>}}ON</w:t>
+            </w:r>
+            <w:proofErr w:type="gramEnd"/>
           </w:p>
         </w:tc>
         <w:tc>
@@ -18594,8 +19570,18 @@
                 <w:sz w:val="24"/>
                 <w:szCs w:val="24"/>
               </w:rPr>
-              <w:t>{{led_NDR_3_off}}OFF</w:t>
-            </w:r>
+              <w:t>{{led_NDR_3_off</w:t>
+            </w:r>
+            <w:proofErr w:type="gramStart"/>
+            <w:r>
+              <w:rPr>
+                <w:rFonts w:asciiTheme="majorBidi" w:hAnsiTheme="majorBidi" w:cstheme="majorBidi"/>
+                <w:sz w:val="24"/>
+                <w:szCs w:val="24"/>
+              </w:rPr>
+              <w:t>}}OFF</w:t>
+            </w:r>
+            <w:proofErr w:type="gramEnd"/>
           </w:p>
         </w:tc>
         <w:tc>
@@ -18618,8 +19604,18 @@
                 <w:sz w:val="24"/>
                 <w:szCs w:val="24"/>
               </w:rPr>
-              <w:t>{{led_NDR_3_blink}}BLINK</w:t>
-            </w:r>
+              <w:t>{{led_NDR_3_blink</w:t>
+            </w:r>
+            <w:proofErr w:type="gramStart"/>
+            <w:r>
+              <w:rPr>
+                <w:rFonts w:asciiTheme="majorBidi" w:hAnsiTheme="majorBidi" w:cstheme="majorBidi"/>
+                <w:sz w:val="24"/>
+                <w:szCs w:val="24"/>
+              </w:rPr>
+              <w:t>}}BLINK</w:t>
+            </w:r>
+            <w:proofErr w:type="gramEnd"/>
           </w:p>
         </w:tc>
         <w:tc>
@@ -18735,8 +19731,18 @@
                 <w:sz w:val="24"/>
                 <w:szCs w:val="24"/>
               </w:rPr>
-              <w:t>{{led_FIR_4_on}}ON</w:t>
-            </w:r>
+              <w:t>{{led_FIR_4_on</w:t>
+            </w:r>
+            <w:proofErr w:type="gramStart"/>
+            <w:r>
+              <w:rPr>
+                <w:rFonts w:asciiTheme="majorBidi" w:hAnsiTheme="majorBidi" w:cstheme="majorBidi"/>
+                <w:sz w:val="24"/>
+                <w:szCs w:val="24"/>
+              </w:rPr>
+              <w:t>}}ON</w:t>
+            </w:r>
+            <w:proofErr w:type="gramEnd"/>
           </w:p>
         </w:tc>
         <w:tc>
@@ -18760,8 +19766,18 @@
                 <w:sz w:val="24"/>
                 <w:szCs w:val="24"/>
               </w:rPr>
-              <w:t>{{led_FIR_4_off}}OFF</w:t>
-            </w:r>
+              <w:t>{{led_FIR_4_off</w:t>
+            </w:r>
+            <w:proofErr w:type="gramStart"/>
+            <w:r>
+              <w:rPr>
+                <w:rFonts w:asciiTheme="majorBidi" w:hAnsiTheme="majorBidi" w:cstheme="majorBidi"/>
+                <w:sz w:val="24"/>
+                <w:szCs w:val="24"/>
+              </w:rPr>
+              <w:t>}}OFF</w:t>
+            </w:r>
+            <w:proofErr w:type="gramEnd"/>
           </w:p>
         </w:tc>
         <w:tc>
@@ -18784,8 +19800,18 @@
                 <w:sz w:val="24"/>
                 <w:szCs w:val="24"/>
               </w:rPr>
-              <w:t>{{led_FIR_4_blink}}BLINK</w:t>
-            </w:r>
+              <w:t>{{led_FIR_4_blink</w:t>
+            </w:r>
+            <w:proofErr w:type="gramStart"/>
+            <w:r>
+              <w:rPr>
+                <w:rFonts w:asciiTheme="majorBidi" w:hAnsiTheme="majorBidi" w:cstheme="majorBidi"/>
+                <w:sz w:val="24"/>
+                <w:szCs w:val="24"/>
+              </w:rPr>
+              <w:t>}}BLINK</w:t>
+            </w:r>
+            <w:proofErr w:type="gramEnd"/>
           </w:p>
         </w:tc>
         <w:tc>
@@ -18901,8 +19927,18 @@
                 <w:sz w:val="24"/>
                 <w:szCs w:val="24"/>
               </w:rPr>
-              <w:t>{{led_DOR_4_on}}ON</w:t>
-            </w:r>
+              <w:t>{{led_DOR_4_on</w:t>
+            </w:r>
+            <w:proofErr w:type="gramStart"/>
+            <w:r>
+              <w:rPr>
+                <w:rFonts w:asciiTheme="majorBidi" w:hAnsiTheme="majorBidi" w:cstheme="majorBidi"/>
+                <w:sz w:val="24"/>
+                <w:szCs w:val="24"/>
+              </w:rPr>
+              <w:t>}}ON</w:t>
+            </w:r>
+            <w:proofErr w:type="gramEnd"/>
           </w:p>
         </w:tc>
         <w:tc>
@@ -18926,8 +19962,18 @@
                 <w:sz w:val="24"/>
                 <w:szCs w:val="24"/>
               </w:rPr>
-              <w:t>{{led_DOR_4_off}}OFF</w:t>
-            </w:r>
+              <w:t>{{led_DOR_4_off</w:t>
+            </w:r>
+            <w:proofErr w:type="gramStart"/>
+            <w:r>
+              <w:rPr>
+                <w:rFonts w:asciiTheme="majorBidi" w:hAnsiTheme="majorBidi" w:cstheme="majorBidi"/>
+                <w:sz w:val="24"/>
+                <w:szCs w:val="24"/>
+              </w:rPr>
+              <w:t>}}OFF</w:t>
+            </w:r>
+            <w:proofErr w:type="gramEnd"/>
           </w:p>
         </w:tc>
         <w:tc>
@@ -18950,8 +19996,18 @@
                 <w:sz w:val="24"/>
                 <w:szCs w:val="24"/>
               </w:rPr>
-              <w:t>{{led_DOR_4_blink}}BLINK</w:t>
-            </w:r>
+              <w:t>{{led_DOR_4_blink</w:t>
+            </w:r>
+            <w:proofErr w:type="gramStart"/>
+            <w:r>
+              <w:rPr>
+                <w:rFonts w:asciiTheme="majorBidi" w:hAnsiTheme="majorBidi" w:cstheme="majorBidi"/>
+                <w:sz w:val="24"/>
+                <w:szCs w:val="24"/>
+              </w:rPr>
+              <w:t>}}BLINK</w:t>
+            </w:r>
+            <w:proofErr w:type="gramEnd"/>
           </w:p>
         </w:tc>
         <w:tc>
@@ -19067,8 +20123,18 @@
                 <w:sz w:val="24"/>
                 <w:szCs w:val="24"/>
               </w:rPr>
-              <w:t>{{led_RDR_4_on}}ON</w:t>
-            </w:r>
+              <w:t>{{led_RDR_4_on</w:t>
+            </w:r>
+            <w:proofErr w:type="gramStart"/>
+            <w:r>
+              <w:rPr>
+                <w:rFonts w:asciiTheme="majorBidi" w:hAnsiTheme="majorBidi" w:cstheme="majorBidi"/>
+                <w:sz w:val="24"/>
+                <w:szCs w:val="24"/>
+              </w:rPr>
+              <w:t>}}ON</w:t>
+            </w:r>
+            <w:proofErr w:type="gramEnd"/>
           </w:p>
         </w:tc>
         <w:tc>
@@ -19092,8 +20158,18 @@
                 <w:sz w:val="24"/>
                 <w:szCs w:val="24"/>
               </w:rPr>
-              <w:t>{{led_RDR_4_off}}OFF</w:t>
-            </w:r>
+              <w:t>{{led_RDR_4_off</w:t>
+            </w:r>
+            <w:proofErr w:type="gramStart"/>
+            <w:r>
+              <w:rPr>
+                <w:rFonts w:asciiTheme="majorBidi" w:hAnsiTheme="majorBidi" w:cstheme="majorBidi"/>
+                <w:sz w:val="24"/>
+                <w:szCs w:val="24"/>
+              </w:rPr>
+              <w:t>}}OFF</w:t>
+            </w:r>
+            <w:proofErr w:type="gramEnd"/>
           </w:p>
         </w:tc>
         <w:tc>
@@ -19116,8 +20192,18 @@
                 <w:sz w:val="24"/>
                 <w:szCs w:val="24"/>
               </w:rPr>
-              <w:t>{{led_RDR_4_blink}}BLINK</w:t>
-            </w:r>
+              <w:t>{{led_RDR_4_blink</w:t>
+            </w:r>
+            <w:proofErr w:type="gramStart"/>
+            <w:r>
+              <w:rPr>
+                <w:rFonts w:asciiTheme="majorBidi" w:hAnsiTheme="majorBidi" w:cstheme="majorBidi"/>
+                <w:sz w:val="24"/>
+                <w:szCs w:val="24"/>
+              </w:rPr>
+              <w:t>}}BLINK</w:t>
+            </w:r>
+            <w:proofErr w:type="gramEnd"/>
           </w:p>
         </w:tc>
         <w:tc>
@@ -19133,13 +20219,23 @@
                 <w:szCs w:val="24"/>
               </w:rPr>
             </w:pPr>
-            <w:r>
-              <w:rPr>
-                <w:rFonts w:asciiTheme="majorBidi" w:hAnsiTheme="majorBidi" w:cstheme="majorBidi"/>
-                <w:sz w:val="24"/>
-                <w:szCs w:val="24"/>
-              </w:rPr>
-              <w:t>{{remark_RDR_4}}</w:t>
+            <w:proofErr w:type="gramStart"/>
+            <w:r>
+              <w:rPr>
+                <w:rFonts w:asciiTheme="majorBidi" w:hAnsiTheme="majorBidi" w:cstheme="majorBidi"/>
+                <w:sz w:val="24"/>
+                <w:szCs w:val="24"/>
+              </w:rPr>
+              <w:t>{{remark_</w:t>
+            </w:r>
+            <w:proofErr w:type="gramEnd"/>
+            <w:r>
+              <w:rPr>
+                <w:rFonts w:asciiTheme="majorBidi" w:hAnsiTheme="majorBidi" w:cstheme="majorBidi"/>
+                <w:sz w:val="24"/>
+                <w:szCs w:val="24"/>
+              </w:rPr>
+              <w:t>RDR_4}}</w:t>
             </w:r>
           </w:p>
         </w:tc>
@@ -19233,8 +20329,18 @@
                 <w:sz w:val="24"/>
                 <w:szCs w:val="24"/>
               </w:rPr>
-              <w:t>{{led_ADCLR_4_on}}ON</w:t>
-            </w:r>
+              <w:t>{{led_ADCLR_4_on</w:t>
+            </w:r>
+            <w:proofErr w:type="gramStart"/>
+            <w:r>
+              <w:rPr>
+                <w:rFonts w:asciiTheme="majorBidi" w:hAnsiTheme="majorBidi" w:cstheme="majorBidi"/>
+                <w:sz w:val="24"/>
+                <w:szCs w:val="24"/>
+              </w:rPr>
+              <w:t>}}ON</w:t>
+            </w:r>
+            <w:proofErr w:type="gramEnd"/>
           </w:p>
         </w:tc>
         <w:tc>
@@ -19258,8 +20364,18 @@
                 <w:sz w:val="24"/>
                 <w:szCs w:val="24"/>
               </w:rPr>
-              <w:t>{{led_ADCLR_4_off}}OFF</w:t>
-            </w:r>
+              <w:t>{{led_ADCLR_4_off</w:t>
+            </w:r>
+            <w:proofErr w:type="gramStart"/>
+            <w:r>
+              <w:rPr>
+                <w:rFonts w:asciiTheme="majorBidi" w:hAnsiTheme="majorBidi" w:cstheme="majorBidi"/>
+                <w:sz w:val="24"/>
+                <w:szCs w:val="24"/>
+              </w:rPr>
+              <w:t>}}OFF</w:t>
+            </w:r>
+            <w:proofErr w:type="gramEnd"/>
           </w:p>
         </w:tc>
         <w:tc>
@@ -19282,8 +20398,18 @@
                 <w:sz w:val="24"/>
                 <w:szCs w:val="24"/>
               </w:rPr>
-              <w:t>{{led_ADCLR_4_blink}}BLINK</w:t>
-            </w:r>
+              <w:t>{{led_ADCLR_4_blink</w:t>
+            </w:r>
+            <w:proofErr w:type="gramStart"/>
+            <w:r>
+              <w:rPr>
+                <w:rFonts w:asciiTheme="majorBidi" w:hAnsiTheme="majorBidi" w:cstheme="majorBidi"/>
+                <w:sz w:val="24"/>
+                <w:szCs w:val="24"/>
+              </w:rPr>
+              <w:t>}}BLINK</w:t>
+            </w:r>
+            <w:proofErr w:type="gramEnd"/>
           </w:p>
         </w:tc>
         <w:tc>
@@ -19299,13 +20425,23 @@
                 <w:szCs w:val="24"/>
               </w:rPr>
             </w:pPr>
-            <w:r>
-              <w:rPr>
-                <w:rFonts w:asciiTheme="majorBidi" w:hAnsiTheme="majorBidi" w:cstheme="majorBidi"/>
-                <w:sz w:val="24"/>
-                <w:szCs w:val="24"/>
-              </w:rPr>
-              <w:t>{{remark_ADCLR_4}}</w:t>
+            <w:proofErr w:type="gramStart"/>
+            <w:r>
+              <w:rPr>
+                <w:rFonts w:asciiTheme="majorBidi" w:hAnsiTheme="majorBidi" w:cstheme="majorBidi"/>
+                <w:sz w:val="24"/>
+                <w:szCs w:val="24"/>
+              </w:rPr>
+              <w:t>{{remark_</w:t>
+            </w:r>
+            <w:proofErr w:type="gramEnd"/>
+            <w:r>
+              <w:rPr>
+                <w:rFonts w:asciiTheme="majorBidi" w:hAnsiTheme="majorBidi" w:cstheme="majorBidi"/>
+                <w:sz w:val="24"/>
+                <w:szCs w:val="24"/>
+              </w:rPr>
+              <w:t>ADCLR_4}}</w:t>
             </w:r>
           </w:p>
         </w:tc>
@@ -19403,8 +20539,18 @@
                 <w:sz w:val="24"/>
                 <w:szCs w:val="24"/>
               </w:rPr>
-              <w:t>{{led_3CTR_2_on}}ON</w:t>
-            </w:r>
+              <w:t>{{led_3CTR_2_on</w:t>
+            </w:r>
+            <w:proofErr w:type="gramStart"/>
+            <w:r>
+              <w:rPr>
+                <w:rFonts w:asciiTheme="majorBidi" w:hAnsiTheme="majorBidi" w:cstheme="majorBidi"/>
+                <w:sz w:val="24"/>
+                <w:szCs w:val="24"/>
+              </w:rPr>
+              <w:t>}}ON</w:t>
+            </w:r>
+            <w:proofErr w:type="gramEnd"/>
           </w:p>
         </w:tc>
         <w:tc>
@@ -19428,8 +20574,18 @@
                 <w:sz w:val="24"/>
                 <w:szCs w:val="24"/>
               </w:rPr>
-              <w:t>{{led_3CTR_2_off}}OFF</w:t>
-            </w:r>
+              <w:t>{{led_3CTR_2_off</w:t>
+            </w:r>
+            <w:proofErr w:type="gramStart"/>
+            <w:r>
+              <w:rPr>
+                <w:rFonts w:asciiTheme="majorBidi" w:hAnsiTheme="majorBidi" w:cstheme="majorBidi"/>
+                <w:sz w:val="24"/>
+                <w:szCs w:val="24"/>
+              </w:rPr>
+              <w:t>}}OFF</w:t>
+            </w:r>
+            <w:proofErr w:type="gramEnd"/>
           </w:p>
         </w:tc>
         <w:tc>
@@ -19452,8 +20608,18 @@
                 <w:sz w:val="24"/>
                 <w:szCs w:val="24"/>
               </w:rPr>
-              <w:t>{{led_3CTR_2_blink}}BLINK</w:t>
-            </w:r>
+              <w:t>{{led_3CTR_2_blink</w:t>
+            </w:r>
+            <w:proofErr w:type="gramStart"/>
+            <w:r>
+              <w:rPr>
+                <w:rFonts w:asciiTheme="majorBidi" w:hAnsiTheme="majorBidi" w:cstheme="majorBidi"/>
+                <w:sz w:val="24"/>
+                <w:szCs w:val="24"/>
+              </w:rPr>
+              <w:t>}}BLINK</w:t>
+            </w:r>
+            <w:proofErr w:type="gramEnd"/>
           </w:p>
         </w:tc>
         <w:tc>
@@ -19569,8 +20735,18 @@
                 <w:sz w:val="24"/>
                 <w:szCs w:val="24"/>
               </w:rPr>
-              <w:t>{{led_4CTR_2_on}}ON</w:t>
-            </w:r>
+              <w:t>{{led_4CTR_2_on</w:t>
+            </w:r>
+            <w:proofErr w:type="gramStart"/>
+            <w:r>
+              <w:rPr>
+                <w:rFonts w:asciiTheme="majorBidi" w:hAnsiTheme="majorBidi" w:cstheme="majorBidi"/>
+                <w:sz w:val="24"/>
+                <w:szCs w:val="24"/>
+              </w:rPr>
+              <w:t>}}ON</w:t>
+            </w:r>
+            <w:proofErr w:type="gramEnd"/>
           </w:p>
         </w:tc>
         <w:tc>
@@ -19594,8 +20770,18 @@
                 <w:sz w:val="24"/>
                 <w:szCs w:val="24"/>
               </w:rPr>
-              <w:t>{{led_4CTR_2_off}}OFF</w:t>
-            </w:r>
+              <w:t>{{led_4CTR_2_off</w:t>
+            </w:r>
+            <w:proofErr w:type="gramStart"/>
+            <w:r>
+              <w:rPr>
+                <w:rFonts w:asciiTheme="majorBidi" w:hAnsiTheme="majorBidi" w:cstheme="majorBidi"/>
+                <w:sz w:val="24"/>
+                <w:szCs w:val="24"/>
+              </w:rPr>
+              <w:t>}}OFF</w:t>
+            </w:r>
+            <w:proofErr w:type="gramEnd"/>
           </w:p>
         </w:tc>
         <w:tc>
@@ -19618,8 +20804,18 @@
                 <w:sz w:val="24"/>
                 <w:szCs w:val="24"/>
               </w:rPr>
-              <w:t>{{led_4CTR_2_blink}}BLINK</w:t>
-            </w:r>
+              <w:t>{{led_4CTR_2_blink</w:t>
+            </w:r>
+            <w:proofErr w:type="gramStart"/>
+            <w:r>
+              <w:rPr>
+                <w:rFonts w:asciiTheme="majorBidi" w:hAnsiTheme="majorBidi" w:cstheme="majorBidi"/>
+                <w:sz w:val="24"/>
+                <w:szCs w:val="24"/>
+              </w:rPr>
+              <w:t>}}BLINK</w:t>
+            </w:r>
+            <w:proofErr w:type="gramEnd"/>
           </w:p>
         </w:tc>
         <w:tc>
@@ -19735,8 +20931,18 @@
                 <w:sz w:val="24"/>
                 <w:szCs w:val="24"/>
               </w:rPr>
-              <w:t>{{led_6CTR_2_on}}ON</w:t>
-            </w:r>
+              <w:t>{{led_6CTR_2_on</w:t>
+            </w:r>
+            <w:proofErr w:type="gramStart"/>
+            <w:r>
+              <w:rPr>
+                <w:rFonts w:asciiTheme="majorBidi" w:hAnsiTheme="majorBidi" w:cstheme="majorBidi"/>
+                <w:sz w:val="24"/>
+                <w:szCs w:val="24"/>
+              </w:rPr>
+              <w:t>}}ON</w:t>
+            </w:r>
+            <w:proofErr w:type="gramEnd"/>
           </w:p>
         </w:tc>
         <w:tc>
@@ -19760,8 +20966,18 @@
                 <w:sz w:val="24"/>
                 <w:szCs w:val="24"/>
               </w:rPr>
-              <w:t>{{led_6CTR_2_off}}OFF</w:t>
-            </w:r>
+              <w:t>{{led_6CTR_2_off</w:t>
+            </w:r>
+            <w:proofErr w:type="gramStart"/>
+            <w:r>
+              <w:rPr>
+                <w:rFonts w:asciiTheme="majorBidi" w:hAnsiTheme="majorBidi" w:cstheme="majorBidi"/>
+                <w:sz w:val="24"/>
+                <w:szCs w:val="24"/>
+              </w:rPr>
+              <w:t>}}OFF</w:t>
+            </w:r>
+            <w:proofErr w:type="gramEnd"/>
           </w:p>
         </w:tc>
         <w:tc>
@@ -19784,8 +21000,18 @@
                 <w:sz w:val="24"/>
                 <w:szCs w:val="24"/>
               </w:rPr>
-              <w:t>{{led_6CTR_2_blink}}BLINK</w:t>
-            </w:r>
+              <w:t>{{led_6CTR_2_blink</w:t>
+            </w:r>
+            <w:proofErr w:type="gramStart"/>
+            <w:r>
+              <w:rPr>
+                <w:rFonts w:asciiTheme="majorBidi" w:hAnsiTheme="majorBidi" w:cstheme="majorBidi"/>
+                <w:sz w:val="24"/>
+                <w:szCs w:val="24"/>
+              </w:rPr>
+              <w:t>}}BLINK</w:t>
+            </w:r>
+            <w:proofErr w:type="gramEnd"/>
           </w:p>
         </w:tc>
         <w:tc>
@@ -19801,13 +21027,23 @@
                 <w:szCs w:val="24"/>
               </w:rPr>
             </w:pPr>
-            <w:r>
-              <w:rPr>
-                <w:rFonts w:asciiTheme="majorBidi" w:hAnsiTheme="majorBidi" w:cstheme="majorBidi"/>
-                <w:sz w:val="24"/>
-                <w:szCs w:val="24"/>
-              </w:rPr>
-              <w:t>{{remark_6CTR_2}}</w:t>
+            <w:proofErr w:type="gramStart"/>
+            <w:r>
+              <w:rPr>
+                <w:rFonts w:asciiTheme="majorBidi" w:hAnsiTheme="majorBidi" w:cstheme="majorBidi"/>
+                <w:sz w:val="24"/>
+                <w:szCs w:val="24"/>
+              </w:rPr>
+              <w:t>{{remark_6CTR</w:t>
+            </w:r>
+            <w:proofErr w:type="gramEnd"/>
+            <w:r>
+              <w:rPr>
+                <w:rFonts w:asciiTheme="majorBidi" w:hAnsiTheme="majorBidi" w:cstheme="majorBidi"/>
+                <w:sz w:val="24"/>
+                <w:szCs w:val="24"/>
+              </w:rPr>
+              <w:t>_2}}</w:t>
             </w:r>
           </w:p>
         </w:tc>
@@ -20768,6 +22004,7 @@
       </w:rPr>
       <w:t>3</w:t>
     </w:r>
+    <w:proofErr w:type="gramStart"/>
     <w:r>
       <w:rPr>
         <w:rFonts w:ascii="Angsana New" w:hAnsi="Angsana New" w:cs="Angsana New"/>
@@ -20776,7 +22013,18 @@
         <w:sz w:val="36"/>
         <w:szCs w:val="36"/>
       </w:rPr>
-      <w:t>) : MITRAC PSDC</w:t>
+      <w:t>) :</w:t>
+    </w:r>
+    <w:proofErr w:type="gramEnd"/>
+    <w:r>
+      <w:rPr>
+        <w:rFonts w:ascii="Angsana New" w:hAnsi="Angsana New" w:cs="Angsana New"/>
+        <w:b/>
+        <w:bCs/>
+        <w:sz w:val="36"/>
+        <w:szCs w:val="36"/>
+      </w:rPr>
+      <w:t xml:space="preserve"> MITRAC PSDC</w:t>
     </w:r>
   </w:p>
 </w:hdr>

</xml_diff>